<commit_message>
vault backup: 2026-06-15 20:01:55
</commit_message>
<xml_diff>
--- a/essay.docx
+++ b/essay.docx
@@ -2,225 +2,7 @@
 <file path=word/document.xml><?xml version="1.0" encoding="utf-8"?>
 <w:document xmlns:wpc="http://schemas.microsoft.com/office/word/2010/wordprocessingCanvas" xmlns:cx="http://schemas.microsoft.com/office/drawing/2014/chartex" xmlns:cx1="http://schemas.microsoft.com/office/drawing/2015/9/8/chartex" xmlns:cx2="http://schemas.microsoft.com/office/drawing/2015/10/21/chartex" xmlns:cx3="http://schemas.microsoft.com/office/drawing/2016/5/9/chartex" xmlns:cx4="http://schemas.microsoft.com/office/drawing/2016/5/10/chartex" xmlns:cx5="http://schemas.microsoft.com/office/drawing/2016/5/11/chartex" xmlns:cx6="http://schemas.microsoft.com/office/drawing/2016/5/12/chartex" xmlns:cx7="http://schemas.microsoft.com/office/drawing/2016/5/13/chartex" xmlns:cx8="http://schemas.microsoft.com/office/drawing/2016/5/14/chartex" xmlns:mc="http://schemas.openxmlformats.org/markup-compatibility/2006" xmlns:aink="http://schemas.microsoft.com/office/drawing/2016/ink" xmlns:am3d="http://schemas.microsoft.com/office/drawing/2017/model3d" xmlns:o="urn:schemas-microsoft-com:office:office" xmlns:r="http://schemas.openxmlformats.org/officeDocument/2006/relationships" xmlns:m="http://schemas.openxmlformats.org/officeDocument/2006/math" xmlns:v="urn:schemas-microsoft-com:vml" xmlns:wp14="http://schemas.microsoft.com/office/word/2010/wordprocessingDrawing" xmlns:wp="http://schemas.openxmlformats.org/drawingml/2006/wordprocessingDrawing" xmlns:w10="urn:schemas-microsoft-com:office:word" xmlns:w="http://schemas.openxmlformats.org/wordprocessingml/2006/main" xmlns:w14="http://schemas.microsoft.com/office/word/2010/wordml" xmlns:w15="http://schemas.microsoft.com/office/word/2012/wordml" xmlns:w16cex="http://schemas.microsoft.com/office/word/2018/wordml/cex" xmlns:w16cid="http://schemas.microsoft.com/office/word/2016/wordml/cid" xmlns:w16="http://schemas.microsoft.com/office/word/2018/wordml" xmlns:w16sdtdh="http://schemas.microsoft.com/office/word/2020/wordml/sdtdatahash" xmlns:w16se="http://schemas.microsoft.com/office/word/2015/wordml/symex" xmlns:wpg="http://schemas.microsoft.com/office/word/2010/wordprocessingGroup" xmlns:wpi="http://schemas.microsoft.com/office/word/2010/wordprocessingInk" xmlns:wne="http://schemas.microsoft.com/office/word/2006/wordml" xmlns:wps="http://schemas.microsoft.com/office/word/2010/wordprocessingShape" mc:Ignorable="w14 w15 w16se w16cid w16 w16cex w16sdtdh wp14">
   <w:body>
-    <w:p>
-      <w:r>
-        <w:t>从行政特批到风险治理：非洲猪瘟保种危机中的动物卫生法制反思</w:t>
-      </w:r>
-    </w:p>
-    <w:p>
-      <w:pPr>
-        <w:rPr>
-          <w:rFonts w:hint="eastAsia"/>
-        </w:rPr>
-      </w:pPr>
-    </w:p>
-    <w:p>
-      <w:r>
-        <w:t xml:space="preserve"> 1. 背景介绍：非洲猪瘟初期的保种危机与“特批式”应对</w:t>
-      </w:r>
-    </w:p>
-    <w:p>
-      <w:pPr>
-        <w:pStyle w:val="a3"/>
-      </w:pPr>
-      <w:r>
-        <w:t>2018年至2019年，非洲猪瘟（ASFV）首次传入我国并呈全国性蔓延态势。</w:t>
-      </w:r>
-      <w:r>
-        <w:rPr>
-          <w:rFonts w:hint="eastAsia"/>
-        </w:rPr>
-        <w:t>面对疫情防范挑战</w:t>
-      </w:r>
-      <w:r>
-        <w:t>，依据《重大动物疫情应急条例》及当时的应急实施方案，疫点周边3公里范围被划定为受威胁区，区域内的易感动物面临着极易被触发的无差别预防性扑杀或极其严苛的禁运封锁。</w:t>
-      </w:r>
-    </w:p>
-    <w:p>
-      <w:pPr>
-        <w:pStyle w:val="a3"/>
-      </w:pPr>
-      <w:r>
-        <w:rPr>
-          <w:rFonts w:hint="eastAsia"/>
-        </w:rPr>
-        <w:t>在这雷霆万钧般的扑杀势头下</w:t>
-      </w:r>
-      <w:r>
-        <w:t>，我国多个拥有核心畜禽遗传资源的“国家级地方猪保种场”相继陷入受威胁区。例如，湖南沙子岭猪、宁乡花猪以及浙江金华两头乌等不可再生的国家级畜禽遗传资源，直面物种灭绝的现实威胁。</w:t>
-      </w:r>
-    </w:p>
-    <w:p>
-      <w:pPr>
-        <w:pStyle w:val="a3"/>
-      </w:pPr>
-      <w:r>
-        <w:t>面对这一困境，为</w:t>
-      </w:r>
-      <w:r>
-        <w:rPr>
-          <w:rFonts w:hint="eastAsia"/>
-        </w:rPr>
-        <w:t>保护</w:t>
-      </w:r>
-      <w:r>
-        <w:t>核心种质</w:t>
-      </w:r>
-      <w:r>
-        <w:rPr>
-          <w:rFonts w:hint="eastAsia"/>
-        </w:rPr>
-        <w:t>资源</w:t>
-      </w:r>
-      <w:r>
-        <w:t>，各地政府与行政主管部门在基层实践中被迫采取了高成本的抢救性保护举措。首先是人工构建物理隔离缓冲带。以湖南沙子岭猪为例，地方政府紧急整合2000万元专项资金，运用行政手段强制清退了核心保种场周边3公里范围内的散养户。这一举措以极高的财政与行政成本，强行在疫区内人工切出了一条生物安全隔离带。其次是极限封闭与抢救性遗传备份。针对浙江金华两头乌等品种，保种团队不仅实施了切断一切内外接触的极端全封闭管理，相关科研团队更是在疫情高压下紧急介入，对核心种群实施活体异地备份，并抢救性地提取精液、体细胞跨区域送往省级基因库进行冷冻保存。</w:t>
-      </w:r>
-    </w:p>
-    <w:p>
-      <w:pPr>
-        <w:pStyle w:val="a3"/>
-      </w:pPr>
-      <w:r>
-        <w:t>这种基层的抢救性实践，随后迅速得到了国家部委的政策确认与制度规范。2018年12月24日，农业农村部办公厅作为首份应急指导文件，正式印发了《关于加强地方猪遗传资源保护工作的通知》（农办种〔2018〕12号）。该通知明确要求对保种场周边3公里范围内养猪场进行全面排查以净化周边环境，规定保种场所在县域发生疫情时实施封场管理，并明确支持加快采集地方猪遗传材料。2019年6月17日，《国家级地方猪遗传材料采集保存工作实施方案》（农种畜函〔2019〕14号）下发，将保护范围覆盖至61个国家级保种场及保护区，并精确规定了每品种冷冻精液与体细胞系的采集底线任务。2019年8月7日，农业农村部正式发布《对十三届全国人大二次会议第8080号建议的答复》（农办议〔2019〕273号），系统回应了防范疫情期间遗传资源丢失风险的各项建议，再次确认了保种场周边3公里红线排查的执行要求，并通报了启用现代遗传材料保护手段及建设备份保种场等政策的落地成果。这一系列国家级公文的密集下发，事实上确立了健康核心种畜群免于预防性扑杀的豁免命运，但也彻底将我国动物卫生法律体系在极端突发公共卫生事件中，必须依赖“临时性通知”来填补“法定技术标准缺失”的结构性痛点暴露无遗。</w:t>
-      </w:r>
-    </w:p>
     <w:p/>
-    <w:p>
-      <w:r>
-        <w:t xml:space="preserve"> 2. 从动物卫生法制角度的相应评价</w:t>
-      </w:r>
-    </w:p>
-    <w:p>
-      <w:r>
-        <w:t xml:space="preserve">   法益冲突取代条文冲突： 严格意义上，《动物防疫法》与《畜牧法》不存在直接的条文冲突，其本质是在极端疫病压力下，“公共卫生安全”与“国家种业战略安全”两大法益发生的剧烈顺位碰撞。</w:t>
-      </w:r>
-    </w:p>
-    <w:p>
-      <w:r>
-        <w:t xml:space="preserve">   定性评价： 危机时刻实施的“特批保种”，是一次行政紧急避险与纠偏。它标志着我国动</w:t>
-      </w:r>
-      <w:r>
-        <w:lastRenderedPageBreak/>
-        <w:t>物防疫制度在实操层面开始由机械的“地理位置绝对消除法（Stamping-out）”被迫向“依赖高级别生物安全（Biosecurity）屏障构建动态边界”的精细化治理演进。</w:t>
-      </w:r>
-    </w:p>
-    <w:p/>
-    <w:p>
-      <w:r>
-        <w:t xml:space="preserve"> 3. “对还是错”的法理判定：基于法益权衡与比例原则的考察</w:t>
-      </w:r>
-    </w:p>
-    <w:p>
-      <w:r>
-        <w:t xml:space="preserve">   法益权衡下的行政裁量： 摒弃“绝对正确”的预设。该行为的本质并非拥有绝对合法的免扑杀授权（在紧急状态下《动物防疫法》效力优先），而是行政机关在面临物种不可逆灭绝时，于两大法益冲突的灰色地带行使的紧急行政裁量。</w:t>
-      </w:r>
-    </w:p>
-    <w:p>
-      <w:r>
-        <w:t xml:space="preserve">   符合比例原则的三阶检验： </w:t>
-      </w:r>
-    </w:p>
-    <w:p>
-      <w:r>
-        <w:t xml:space="preserve">       妥当性： 人工清退与极限封闭能客观阻断病毒，实现防疫目的。</w:t>
-      </w:r>
-    </w:p>
-    <w:p>
-      <w:r>
-        <w:t xml:space="preserve">       必要性： 相比一刀切扑杀，封闭隔离加核酸监测是对种质资源法益损害最小的干预方式。</w:t>
-      </w:r>
-    </w:p>
-    <w:p>
-      <w:r>
-        <w:t xml:space="preserve">       均衡性： 保全不可再生的国家基因库，其长远战略利益大于短期增加的防疫管理成本。</w:t>
-      </w:r>
-    </w:p>
-    <w:p>
-      <w:r>
-        <w:t xml:space="preserve">   风险评估前置： 虽符合比例原则，但因缺乏法定验证机制，强行保留疫区宿主客观放大了溢出风险，亟需由“特批”向“基于风险评估的条件性豁免”转型。</w:t>
-      </w:r>
-    </w:p>
-    <w:p/>
-    <w:p>
-      <w:r>
-        <w:t xml:space="preserve"> 4. 从动物卫生法制角度解析原因：合法豁免缘何难以落地</w:t>
-      </w:r>
-    </w:p>
-    <w:p>
-      <w:r>
-        <w:rPr>
-          <w:rFonts w:hint="eastAsia"/>
-        </w:rPr>
-        <w:t>核心痛点并非简单的“两法衔接不畅”，而是缺乏一套从“顶层授权”到“基层执行”的完整传导机制，具体表现为三个层面的断层：</w:t>
-      </w:r>
-    </w:p>
-    <w:p>
-      <w:r>
-        <w:t xml:space="preserve">   技术标准缺失（有法可依，无章可循）： 重大动物疫情应急预案体系中，缺失配套的“高等级生物安全养殖设施标准”和“特许检疫规范”，使得豁免在实操中形同走钢丝。</w:t>
-      </w:r>
-    </w:p>
-    <w:p>
-      <w:r>
-        <w:t xml:space="preserve">   行政激励扭曲（避责逻辑）： 在基层，“依法扑灭”是安全的免责牌，而“特批保种”一旦散毒则面临渎职问责。不对等的问责压力导致基层倾向“宁可错杀、不可漏杀”。</w:t>
-      </w:r>
-    </w:p>
-    <w:p>
-      <w:r>
-        <w:t xml:space="preserve">   风险承担主体缺位： 若豁免期内成为新疫源地，连带责任及经济损失由谁（保种场、审批政府或专家）承担？现行法律未能厘清，导致决策阻力极大。</w:t>
-      </w:r>
-    </w:p>
-    <w:p/>
-    <w:p>
-      <w:r>
-        <w:t xml:space="preserve"> 5. 从动物卫生法制角度给出解决方案</w:t>
-      </w:r>
-    </w:p>
-    <w:p>
-      <w:r>
-        <w:t xml:space="preserve">   国内经验提炼： 将被动经验升华为法定的“隔离缓冲 + 遗传备份”双轨机制。</w:t>
-      </w:r>
-    </w:p>
-    <w:p>
-      <w:r>
-        <w:t xml:space="preserve">   他山之石： 借鉴欧盟针对高生物安全级别农场的风险评估豁免程序，以及美国（USDA）遗传资源强制备份与非常态跨州特许流转指南。</w:t>
-      </w:r>
-    </w:p>
-    <w:p>
-      <w:r>
-        <w:t xml:space="preserve">   制度桥梁设计：</w:t>
-      </w:r>
-    </w:p>
-    <w:p>
-      <w:r>
-        <w:t xml:space="preserve">       技术指标重构： 在修法中明确将“达到国家规定的高等级生物安全养殖设施标准（如具备空气过滤与正压通风系统）”作为启动特许豁免的物理前置条件（弃用实验室BSL-3概念）。</w:t>
-      </w:r>
-    </w:p>
-    <w:p>
-      <w:r>
-        <w:t xml:space="preserve">       设立风险评估委员会制度： 由独立专家组审核申请并出具量化风险报告。</w:t>
-      </w:r>
-    </w:p>
-    <w:p>
-      <w:r>
-        <w:t xml:space="preserve">       建立责任豁免机制： 对依法按技术标准实施豁免的基层执法人员实行尽职免责。</w:t>
-      </w:r>
-    </w:p>
-    <w:p/>
-    <w:p>
-      <w:r>
-        <w:t xml:space="preserve"> 6. 讨论挑战、启示和展望</w:t>
-      </w:r>
-    </w:p>
-    <w:p>
-      <w:r>
-        <w:t xml:space="preserve">   现实挑战的逻辑闭环： 异地遗传备份虽是必要手段，但在高载量病原区提取遗传物质极易引发次生散毒。必须将此类抢救严格限定在“严苛病原学定点监测与特许检疫程序”内。同时需建立严密的审核机制，防止商业资本“伪保种、真逃避”的寻租风险。</w:t>
-      </w:r>
-    </w:p>
-    <w:p>
-      <w:r>
-        <w:t xml:space="preserve">   启示与展望： 全文核心结论——我国现行动物卫生法律体系并不存在根本的法理冲突，真正缺失的是将“遗传资源保护例外”转化为可执行、可问责、可验证技术程序的制度桥梁。未来的修法必须走向跨学科融合，将兽医流行病学模型与环境控制工程参数直接写入法条。</w:t>
-      </w:r>
-    </w:p>
     <w:sectPr>
       <w:pgSz w:w="11906" w:h="16838"/>
       <w:pgMar w:top="1440" w:right="1800" w:bottom="1440" w:left="1800" w:header="851" w:footer="992" w:gutter="0"/>

</xml_diff>

<commit_message>
vault backup: 2026-06-16 08:34:36
</commit_message>
<xml_diff>
--- a/essay.docx
+++ b/essay.docx
@@ -2,7 +2,83 @@
 <file path=word/document.xml><?xml version="1.0" encoding="utf-8"?>
 <w:document xmlns:wpc="http://schemas.microsoft.com/office/word/2010/wordprocessingCanvas" xmlns:cx="http://schemas.microsoft.com/office/drawing/2014/chartex" xmlns:cx1="http://schemas.microsoft.com/office/drawing/2015/9/8/chartex" xmlns:cx2="http://schemas.microsoft.com/office/drawing/2015/10/21/chartex" xmlns:cx3="http://schemas.microsoft.com/office/drawing/2016/5/9/chartex" xmlns:cx4="http://schemas.microsoft.com/office/drawing/2016/5/10/chartex" xmlns:cx5="http://schemas.microsoft.com/office/drawing/2016/5/11/chartex" xmlns:cx6="http://schemas.microsoft.com/office/drawing/2016/5/12/chartex" xmlns:cx7="http://schemas.microsoft.com/office/drawing/2016/5/13/chartex" xmlns:cx8="http://schemas.microsoft.com/office/drawing/2016/5/14/chartex" xmlns:mc="http://schemas.openxmlformats.org/markup-compatibility/2006" xmlns:aink="http://schemas.microsoft.com/office/drawing/2016/ink" xmlns:am3d="http://schemas.microsoft.com/office/drawing/2017/model3d" xmlns:o="urn:schemas-microsoft-com:office:office" xmlns:r="http://schemas.openxmlformats.org/officeDocument/2006/relationships" xmlns:m="http://schemas.openxmlformats.org/officeDocument/2006/math" xmlns:v="urn:schemas-microsoft-com:vml" xmlns:wp14="http://schemas.microsoft.com/office/word/2010/wordprocessingDrawing" xmlns:wp="http://schemas.openxmlformats.org/drawingml/2006/wordprocessingDrawing" xmlns:w10="urn:schemas-microsoft-com:office:word" xmlns:w="http://schemas.openxmlformats.org/wordprocessingml/2006/main" xmlns:w14="http://schemas.microsoft.com/office/word/2010/wordml" xmlns:w15="http://schemas.microsoft.com/office/word/2012/wordml" xmlns:w16cex="http://schemas.microsoft.com/office/word/2018/wordml/cex" xmlns:w16cid="http://schemas.microsoft.com/office/word/2016/wordml/cid" xmlns:w16="http://schemas.microsoft.com/office/word/2018/wordml" xmlns:w16sdtdh="http://schemas.microsoft.com/office/word/2020/wordml/sdtdatahash" xmlns:w16se="http://schemas.microsoft.com/office/word/2015/wordml/symex" xmlns:wpg="http://schemas.microsoft.com/office/word/2010/wordprocessingGroup" xmlns:wpi="http://schemas.microsoft.com/office/word/2010/wordprocessingInk" xmlns:wne="http://schemas.microsoft.com/office/word/2006/wordml" xmlns:wps="http://schemas.microsoft.com/office/word/2010/wordprocessingShape" mc:Ignorable="w14 w15 w16se w16cid w16 w16cex w16sdtdh wp14">
   <w:body>
-    <w:p/>
+    <w:p>
+      <w:r>
+        <w:rPr>
+          <w:rFonts w:hint="eastAsia"/>
+        </w:rPr>
+        <w:t>背景介绍</w:t>
+      </w:r>
+    </w:p>
+    <w:p>
+      <w:pPr>
+        <w:widowControl/>
+        <w:spacing w:before="100" w:beforeAutospacing="1" w:after="100" w:afterAutospacing="1"/>
+        <w:jc w:val="left"/>
+        <w:rPr>
+          <w:rFonts w:ascii="宋体" w:eastAsia="宋体" w:hAnsi="宋体" w:cs="宋体"/>
+          <w:kern w:val="0"/>
+          <w:sz w:val="24"/>
+          <w:szCs w:val="24"/>
+        </w:rPr>
+      </w:pPr>
+      <w:r>
+        <w:rPr>
+          <w:rFonts w:ascii="宋体" w:eastAsia="宋体" w:hAnsi="宋体" w:cs="宋体"/>
+          <w:kern w:val="0"/>
+          <w:sz w:val="24"/>
+          <w:szCs w:val="24"/>
+        </w:rPr>
+        <w:t>近年来，</w:t>
+      </w:r>
+      <w:r>
+        <w:rPr>
+          <w:rFonts w:ascii="宋体" w:eastAsia="宋体" w:hAnsi="宋体" w:cs="宋体" w:hint="eastAsia"/>
+          <w:kern w:val="0"/>
+          <w:sz w:val="24"/>
+          <w:szCs w:val="24"/>
+        </w:rPr>
+        <w:t>通过网络进行宠物交易的模式迅猛</w:t>
+      </w:r>
+      <w:r>
+        <w:rPr>
+          <w:rFonts w:ascii="宋体" w:eastAsia="宋体" w:hAnsi="宋体" w:cs="宋体"/>
+          <w:kern w:val="0"/>
+          <w:sz w:val="24"/>
+          <w:szCs w:val="24"/>
+        </w:rPr>
+        <w:t>发展，淘宝、闲鱼、抖音等平台已成为活体宠物交易的重要渠道。在市场规模持续扩大的同时，大量消费者反映收到“星期宠”、宠物运输途中死亡、商家无法提供检疫证明等恶劣情况。这种脱离常规监管的活体寄递行为，不仅存在于伴侣动物市场，更向野生动物领域蔓延，呈现出明显的普遍化与产业化特征。</w:t>
+      </w:r>
+    </w:p>
+    <w:p>
+      <w:pPr>
+        <w:widowControl/>
+        <w:spacing w:before="100" w:beforeAutospacing="1" w:after="100" w:afterAutospacing="1"/>
+        <w:jc w:val="left"/>
+        <w:rPr>
+          <w:rFonts w:ascii="宋体" w:eastAsia="宋体" w:hAnsi="宋体" w:cs="宋体"/>
+          <w:kern w:val="0"/>
+          <w:sz w:val="24"/>
+          <w:szCs w:val="24"/>
+        </w:rPr>
+      </w:pPr>
+      <w:r>
+        <w:rPr>
+          <w:rFonts w:ascii="宋体" w:eastAsia="宋体" w:hAnsi="宋体" w:cs="宋体"/>
+          <w:kern w:val="0"/>
+          <w:sz w:val="24"/>
+          <w:szCs w:val="24"/>
+        </w:rPr>
+        <w:t>国内媒体对全国重要宠物繁育基地江苏徐州的专项调查揭示，每日有数百件活体猫狗通过普通快递网络流向全国。托运中介公然宣称“无需检疫证明”，致使活体动物与普通货物混装运输，频繁发生致死事件。此外，2026年6月，辽宁省葫芦岛市公安机关破获一起案件，嫌疑人利用曾经作为快递员的便利，假借普通货物名义违规邮寄228只国家“三有”保护鸟类。这两个案例相互印证，暴露了活体动物网络交易背后一条成熟的、刻意规避监管的“地下”流通网络。</w:t>
+      </w:r>
+    </w:p>
+    <w:p>
+      <w:pPr>
+        <w:rPr>
+          <w:rFonts w:hint="eastAsia"/>
+        </w:rPr>
+      </w:pPr>
+    </w:p>
     <w:sectPr>
       <w:pgSz w:w="11906" w:h="16838"/>
       <w:pgMar w:top="1440" w:right="1800" w:bottom="1440" w:left="1800" w:header="851" w:footer="992" w:gutter="0"/>

</xml_diff>

<commit_message>
vault backup: 2026-06-16 09:19:39
</commit_message>
<xml_diff>
--- a/essay.docx
+++ b/essay.docx
@@ -73,11 +73,148 @@
       </w:r>
     </w:p>
     <w:p>
-      <w:pPr>
-        <w:rPr>
-          <w:rFonts w:hint="eastAsia"/>
-        </w:rPr>
-      </w:pPr>
+      <w:r>
+        <w:rPr>
+          <w:rFonts w:hint="eastAsia"/>
+        </w:rPr>
+        <w:t>法规角度评价</w:t>
+      </w:r>
+    </w:p>
+    <w:p>
+      <w:pPr>
+        <w:pStyle w:val="a3"/>
+      </w:pPr>
+      <w:r>
+        <w:rPr>
+          <w:rFonts w:hint="eastAsia"/>
+        </w:rPr>
+        <w:t>针对</w:t>
+      </w:r>
+      <w:r>
+        <w:t>上述现象，表面上看是一个典型的消费者权益保护与合同违约问题。但剥离</w:t>
+      </w:r>
+      <w:r>
+        <w:rPr>
+          <w:rFonts w:hint="eastAsia"/>
+        </w:rPr>
+        <w:t>其商业表面的外壳</w:t>
+      </w:r>
+      <w:r>
+        <w:t>，从动物卫生法制的</w:t>
+      </w:r>
+      <w:r>
+        <w:rPr>
+          <w:rFonts w:hint="eastAsia"/>
+        </w:rPr>
+        <w:t>逻辑</w:t>
+      </w:r>
+      <w:r>
+        <w:t>进行</w:t>
+      </w:r>
+      <w:r>
+        <w:rPr>
+          <w:rFonts w:hint="eastAsia"/>
+        </w:rPr>
+        <w:t>剖析不难发现其中蕴含的</w:t>
+      </w:r>
+      <w:r>
+        <w:rPr>
+          <w:b/>
+          <w:bCs/>
+        </w:rPr>
+        <w:t>动物检疫制度落实严重不足</w:t>
+      </w:r>
+      <w:r>
+        <w:rPr>
+          <w:rFonts w:hint="eastAsia"/>
+        </w:rPr>
+        <w:t>、</w:t>
+      </w:r>
+      <w:r>
+        <w:rPr>
+          <w:b/>
+          <w:bCs/>
+        </w:rPr>
+        <w:t>活体动物跨区域流动监管缺失</w:t>
+      </w:r>
+      <w:r>
+        <w:rPr>
+          <w:rFonts w:hint="eastAsia"/>
+        </w:rPr>
+        <w:t>等问题，给公共卫生带来了巨大挑战</w:t>
+      </w:r>
+      <w:r>
+        <w:rPr>
+          <w:rFonts w:hint="eastAsia"/>
+        </w:rPr>
+        <w:t>。</w:t>
+      </w:r>
+    </w:p>
+    <w:p>
+      <w:pPr>
+        <w:pStyle w:val="a3"/>
+      </w:pPr>
+      <w:r>
+        <w:t>从法理上讲，网络宠物交易作为一种依托电子商务开展的商品流通方式，其本身并不为法律所禁止。依法检疫、依法运输、合法经营的宠物交易，属于市场主体的私权自治范畴，受到《民法典》及《电子商务法》的保护。</w:t>
+      </w:r>
+    </w:p>
+    <w:p>
+      <w:pPr>
+        <w:pStyle w:val="a3"/>
+      </w:pPr>
+      <w:r>
+        <w:t>然而，活体动物属于具有传播疫病风险的特殊客体。因此，网络宠物交易不仅受制于私法规则，更必须绝对服从于动物卫生公法的强制性约束。网购宠物行为合法性的根本前提，在于买卖双方及承运人是否严格履行了国家法定动物防疫义务。</w:t>
+      </w:r>
+    </w:p>
+    <w:p/>
+    <w:p>
+      <w:r>
+        <w:rPr>
+          <w:rFonts w:hint="eastAsia"/>
+        </w:rPr>
+        <w:t>从动物卫生法制角度，相应评价；</w:t>
+      </w:r>
+    </w:p>
+    <w:p/>
+    <w:p>
+      <w:r>
+        <w:rPr>
+          <w:rFonts w:hint="eastAsia"/>
+        </w:rPr>
+        <w:t>“对还是错”，“对错在哪里”；</w:t>
+      </w:r>
+    </w:p>
+    <w:p/>
+    <w:p>
+      <w:r>
+        <w:rPr>
+          <w:rFonts w:hint="eastAsia"/>
+        </w:rPr>
+        <w:t>从动物卫生法制角度，解析原因：对错的原因；</w:t>
+      </w:r>
+    </w:p>
+    <w:p/>
+    <w:p>
+      <w:r>
+        <w:rPr>
+          <w:rFonts w:hint="eastAsia"/>
+        </w:rPr>
+        <w:t>从动物卫生法制角度，给出解决方案；</w:t>
+      </w:r>
+    </w:p>
+    <w:p/>
+    <w:p>
+      <w:pPr>
+        <w:rPr>
+          <w:rFonts w:hint="eastAsia"/>
+        </w:rPr>
+      </w:pPr>
+      <w:r>
+        <w:rPr>
+          <w:rFonts w:hint="eastAsia"/>
+        </w:rPr>
+        <w:t>讨论挑战，启示和展望。</w:t>
+      </w:r>
     </w:p>
     <w:sectPr>
       <w:pgSz w:w="11906" w:h="16838"/>
@@ -87,6 +224,127 @@
     </w:sectPr>
   </w:body>
 </w:document>
+</file>
+
+<file path=word/numbering.xml><?xml version="1.0" encoding="utf-8"?>
+<w:numbering xmlns:wpc="http://schemas.microsoft.com/office/word/2010/wordprocessingCanvas" xmlns:cx="http://schemas.microsoft.com/office/drawing/2014/chartex" xmlns:cx1="http://schemas.microsoft.com/office/drawing/2015/9/8/chartex" xmlns:cx2="http://schemas.microsoft.com/office/drawing/2015/10/21/chartex" xmlns:cx3="http://schemas.microsoft.com/office/drawing/2016/5/9/chartex" xmlns:cx4="http://schemas.microsoft.com/office/drawing/2016/5/10/chartex" xmlns:cx5="http://schemas.microsoft.com/office/drawing/2016/5/11/chartex" xmlns:cx6="http://schemas.microsoft.com/office/drawing/2016/5/12/chartex" xmlns:cx7="http://schemas.microsoft.com/office/drawing/2016/5/13/chartex" xmlns:cx8="http://schemas.microsoft.com/office/drawing/2016/5/14/chartex" xmlns:mc="http://schemas.openxmlformats.org/markup-compatibility/2006" xmlns:aink="http://schemas.microsoft.com/office/drawing/2016/ink" xmlns:am3d="http://schemas.microsoft.com/office/drawing/2017/model3d" xmlns:o="urn:schemas-microsoft-com:office:office" xmlns:r="http://schemas.openxmlformats.org/officeDocument/2006/relationships" xmlns:m="http://schemas.openxmlformats.org/officeDocument/2006/math" xmlns:v="urn:schemas-microsoft-com:vml" xmlns:wp14="http://schemas.microsoft.com/office/word/2010/wordprocessingDrawing" xmlns:wp="http://schemas.openxmlformats.org/drawingml/2006/wordprocessingDrawing" xmlns:w10="urn:schemas-microsoft-com:office:word" xmlns:w="http://schemas.openxmlformats.org/wordprocessingml/2006/main" xmlns:w14="http://schemas.microsoft.com/office/word/2010/wordml" xmlns:w15="http://schemas.microsoft.com/office/word/2012/wordml" xmlns:w16cex="http://schemas.microsoft.com/office/word/2018/wordml/cex" xmlns:w16cid="http://schemas.microsoft.com/office/word/2016/wordml/cid" xmlns:w16="http://schemas.microsoft.com/office/word/2018/wordml" xmlns:w16sdtdh="http://schemas.microsoft.com/office/word/2020/wordml/sdtdatahash" xmlns:w16se="http://schemas.microsoft.com/office/word/2015/wordml/symex" xmlns:wpg="http://schemas.microsoft.com/office/word/2010/wordprocessingGroup" xmlns:wpi="http://schemas.microsoft.com/office/word/2010/wordprocessingInk" xmlns:wne="http://schemas.microsoft.com/office/word/2006/wordml" xmlns:wps="http://schemas.microsoft.com/office/word/2010/wordprocessingShape" mc:Ignorable="w14 w15 w16se w16cid w16 w16cex w16sdtdh wp14">
+  <w:abstractNum w:abstractNumId="0" w15:restartNumberingAfterBreak="0">
+    <w:nsid w:val="6AC25EBA"/>
+    <w:multiLevelType w:val="multilevel"/>
+    <w:tmpl w:val="93C2ED58"/>
+    <w:lvl w:ilvl="0">
+      <w:start w:val="1"/>
+      <w:numFmt w:val="decimal"/>
+      <w:lvlText w:val="%1."/>
+      <w:lvlJc w:val="left"/>
+      <w:pPr>
+        <w:tabs>
+          <w:tab w:val="num" w:pos="720"/>
+        </w:tabs>
+        <w:ind w:left="720" w:hanging="360"/>
+      </w:pPr>
+    </w:lvl>
+    <w:lvl w:ilvl="1" w:tentative="1">
+      <w:start w:val="1"/>
+      <w:numFmt w:val="decimal"/>
+      <w:lvlText w:val="%2."/>
+      <w:lvlJc w:val="left"/>
+      <w:pPr>
+        <w:tabs>
+          <w:tab w:val="num" w:pos="1440"/>
+        </w:tabs>
+        <w:ind w:left="1440" w:hanging="360"/>
+      </w:pPr>
+    </w:lvl>
+    <w:lvl w:ilvl="2" w:tentative="1">
+      <w:start w:val="1"/>
+      <w:numFmt w:val="decimal"/>
+      <w:lvlText w:val="%3."/>
+      <w:lvlJc w:val="left"/>
+      <w:pPr>
+        <w:tabs>
+          <w:tab w:val="num" w:pos="2160"/>
+        </w:tabs>
+        <w:ind w:left="2160" w:hanging="360"/>
+      </w:pPr>
+    </w:lvl>
+    <w:lvl w:ilvl="3" w:tentative="1">
+      <w:start w:val="1"/>
+      <w:numFmt w:val="decimal"/>
+      <w:lvlText w:val="%4."/>
+      <w:lvlJc w:val="left"/>
+      <w:pPr>
+        <w:tabs>
+          <w:tab w:val="num" w:pos="2880"/>
+        </w:tabs>
+        <w:ind w:left="2880" w:hanging="360"/>
+      </w:pPr>
+    </w:lvl>
+    <w:lvl w:ilvl="4" w:tentative="1">
+      <w:start w:val="1"/>
+      <w:numFmt w:val="decimal"/>
+      <w:lvlText w:val="%5."/>
+      <w:lvlJc w:val="left"/>
+      <w:pPr>
+        <w:tabs>
+          <w:tab w:val="num" w:pos="3600"/>
+        </w:tabs>
+        <w:ind w:left="3600" w:hanging="360"/>
+      </w:pPr>
+    </w:lvl>
+    <w:lvl w:ilvl="5" w:tentative="1">
+      <w:start w:val="1"/>
+      <w:numFmt w:val="decimal"/>
+      <w:lvlText w:val="%6."/>
+      <w:lvlJc w:val="left"/>
+      <w:pPr>
+        <w:tabs>
+          <w:tab w:val="num" w:pos="4320"/>
+        </w:tabs>
+        <w:ind w:left="4320" w:hanging="360"/>
+      </w:pPr>
+    </w:lvl>
+    <w:lvl w:ilvl="6" w:tentative="1">
+      <w:start w:val="1"/>
+      <w:numFmt w:val="decimal"/>
+      <w:lvlText w:val="%7."/>
+      <w:lvlJc w:val="left"/>
+      <w:pPr>
+        <w:tabs>
+          <w:tab w:val="num" w:pos="5040"/>
+        </w:tabs>
+        <w:ind w:left="5040" w:hanging="360"/>
+      </w:pPr>
+    </w:lvl>
+    <w:lvl w:ilvl="7" w:tentative="1">
+      <w:start w:val="1"/>
+      <w:numFmt w:val="decimal"/>
+      <w:lvlText w:val="%8."/>
+      <w:lvlJc w:val="left"/>
+      <w:pPr>
+        <w:tabs>
+          <w:tab w:val="num" w:pos="5760"/>
+        </w:tabs>
+        <w:ind w:left="5760" w:hanging="360"/>
+      </w:pPr>
+    </w:lvl>
+    <w:lvl w:ilvl="8" w:tentative="1">
+      <w:start w:val="1"/>
+      <w:numFmt w:val="decimal"/>
+      <w:lvlText w:val="%9."/>
+      <w:lvlJc w:val="left"/>
+      <w:pPr>
+        <w:tabs>
+          <w:tab w:val="num" w:pos="6480"/>
+        </w:tabs>
+        <w:ind w:left="6480" w:hanging="360"/>
+      </w:pPr>
+    </w:lvl>
+  </w:abstractNum>
+  <w:num w:numId="1">
+    <w:abstractNumId w:val="0"/>
+  </w:num>
+</w:numbering>
 </file>
 
 <file path=word/styles.xml><?xml version="1.0" encoding="utf-8"?>

</xml_diff>

<commit_message>
vault backup: 2026-06-16 10:17:12
</commit_message>
<xml_diff>
--- a/essay.docx
+++ b/essay.docx
@@ -85,37 +85,168 @@
         <w:pStyle w:val="a3"/>
       </w:pPr>
       <w:r>
-        <w:rPr>
-          <w:rFonts w:hint="eastAsia"/>
-        </w:rPr>
-        <w:t>针对</w:t>
-      </w:r>
-      <w:r>
-        <w:t>上述现象，表面上看是一个典型的消费者权益保护与合同违约问题。但剥离</w:t>
-      </w:r>
-      <w:r>
-        <w:rPr>
-          <w:rFonts w:hint="eastAsia"/>
-        </w:rPr>
-        <w:t>其商业表面的外壳</w:t>
-      </w:r>
-      <w:r>
-        <w:t>，从动物卫生法制的</w:t>
-      </w:r>
-      <w:r>
-        <w:rPr>
-          <w:rFonts w:hint="eastAsia"/>
-        </w:rPr>
-        <w:t>逻辑</w:t>
-      </w:r>
-      <w:r>
-        <w:t>进行</w:t>
-      </w:r>
-      <w:r>
-        <w:rPr>
-          <w:rFonts w:hint="eastAsia"/>
-        </w:rPr>
-        <w:t>剖析不难发现其中蕴含的</w:t>
+        <w:t>网络宠物交易作为依托数字经济开展的新型商业模式，其本身受到《民法典》及《电子商务法》对市场主体“私权自治”与“贸易自由”的保护。然而，活体动物</w:t>
+      </w:r>
+      <w:r>
+        <w:rPr>
+          <w:rFonts w:hint="eastAsia"/>
+        </w:rPr>
+        <w:t>是</w:t>
+      </w:r>
+      <w:r>
+        <w:t>兼具财产属性</w:t>
+      </w:r>
+      <w:r>
+        <w:rPr>
+          <w:rFonts w:hint="eastAsia"/>
+        </w:rPr>
+        <w:t>与病原传播载体</w:t>
+      </w:r>
+      <w:r>
+        <w:t>双重特征</w:t>
+      </w:r>
+      <w:r>
+        <w:rPr>
+          <w:rFonts w:hint="eastAsia"/>
+        </w:rPr>
+        <w:t>的特殊商品</w:t>
+      </w:r>
+      <w:r>
+        <w:t>。因此，活体宠物的网络交易必须</w:t>
+      </w:r>
+      <w:r>
+        <w:rPr>
+          <w:rFonts w:hint="eastAsia"/>
+        </w:rPr>
+        <w:t>在</w:t>
+      </w:r>
+      <w:r>
+        <w:t>动物卫生</w:t>
+      </w:r>
+      <w:r>
+        <w:rPr>
+          <w:rFonts w:hint="eastAsia"/>
+        </w:rPr>
+        <w:t>法规</w:t>
+      </w:r>
+      <w:r>
+        <w:t>的强制性约束</w:t>
+      </w:r>
+      <w:r>
+        <w:rPr>
+          <w:rFonts w:hint="eastAsia"/>
+        </w:rPr>
+        <w:t>下进行</w:t>
+      </w:r>
+      <w:r>
+        <w:t>。评价网购宠物行为的合法性，</w:t>
+      </w:r>
+      <w:r>
+        <w:rPr>
+          <w:rFonts w:hint="eastAsia"/>
+        </w:rPr>
+        <w:t>需结合</w:t>
+      </w:r>
+      <w:r>
+        <w:t>《中华人民共和国动物防疫法》</w:t>
+      </w:r>
+      <w:r>
+        <w:rPr>
+          <w:rFonts w:hint="eastAsia"/>
+        </w:rPr>
+        <w:t>规定的各项法定义务对产业链各环节进行评价：作为源头的网络商家在未向当地动物卫生监督机构报检的情况下直接将活体动物发货，违反了《动物防疫法》</w:t>
+      </w:r>
+      <w:r>
+        <w:rPr>
+          <w:rFonts w:hint="eastAsia"/>
+        </w:rPr>
+        <w:t>第四十九条</w:t>
+      </w:r>
+      <w:r>
+        <w:rPr>
+          <w:rFonts w:hint="eastAsia"/>
+        </w:rPr>
+        <w:t>“</w:t>
+      </w:r>
+      <w:r>
+        <w:t>屠宰、出售或者运输动物以及出售或者运输动物产品前，货主应当按照国务院农业农村主管部门的规定向所在地动物卫生监督机构申报检疫</w:t>
+      </w:r>
+      <w:r>
+        <w:rPr>
+          <w:rFonts w:hint="eastAsia"/>
+        </w:rPr>
+        <w:t>”以及第二十九条</w:t>
+      </w:r>
+      <w:r>
+        <w:rPr>
+          <w:rFonts w:hint="eastAsia"/>
+        </w:rPr>
+        <w:t>第三项所禁止的“依法应当检疫而未经检疫”</w:t>
+      </w:r>
+      <w:r>
+        <w:rPr>
+          <w:rFonts w:hint="eastAsia"/>
+        </w:rPr>
+        <w:t>；</w:t>
+      </w:r>
+      <w:r>
+        <w:t>快递物流企业对“宠物盲盒”闭眼收寄，且将其与普通货物混装于缺乏温控、通风设备的普通货车中</w:t>
+      </w:r>
+      <w:r>
+        <w:rPr>
+          <w:rFonts w:hint="eastAsia"/>
+        </w:rPr>
+        <w:t>既</w:t>
+      </w:r>
+      <w:r>
+        <w:t>违反了《动物防疫法》第五十二条中承运人“无检疫证明不得承运”的强制核验责任</w:t>
+      </w:r>
+      <w:r>
+        <w:rPr>
+          <w:rFonts w:hint="eastAsia"/>
+        </w:rPr>
+        <w:t>，又</w:t>
+      </w:r>
+      <w:r>
+        <w:t>违反了第五十四条对动物运输车辆及设备的专门防疫卫生要求。</w:t>
+      </w:r>
+    </w:p>
+    <w:p>
+      <w:pPr>
+        <w:pStyle w:val="a3"/>
+        <w:rPr>
+          <w:rFonts w:hint="eastAsia"/>
+        </w:rPr>
+      </w:pPr>
+      <w:r>
+        <w:t>脱离法定检验检疫与卫生运输规范的网络宠物交易，不仅是</w:t>
+      </w:r>
+      <w:r>
+        <w:rPr>
+          <w:rFonts w:hint="eastAsia"/>
+        </w:rPr>
+        <w:t>对公众</w:t>
+      </w:r>
+      <w:r>
+        <w:rPr>
+          <w:rFonts w:hint="eastAsia"/>
+        </w:rPr>
+        <w:t>合理</w:t>
+      </w:r>
+      <w:r>
+        <w:rPr>
+          <w:rFonts w:hint="eastAsia"/>
+        </w:rPr>
+        <w:t>消费权益的侵犯</w:t>
+      </w:r>
+      <w:r>
+        <w:t>，更</w:t>
+      </w:r>
+      <w:r>
+        <w:rPr>
+          <w:rFonts w:hint="eastAsia"/>
+        </w:rPr>
+        <w:t>暴露出</w:t>
       </w:r>
       <w:r>
         <w:rPr>
@@ -141,13 +272,21 @@
         <w:rPr>
           <w:rFonts w:hint="eastAsia"/>
         </w:rPr>
-        <w:t>等问题，给公共卫生带来了巨大挑战</w:t>
-      </w:r>
-      <w:r>
-        <w:rPr>
-          <w:rFonts w:hint="eastAsia"/>
-        </w:rPr>
-        <w:t>。</w:t>
+        <w:t>等问题，给公共卫生带来了巨大挑战。</w:t>
+      </w:r>
+    </w:p>
+    <w:p>
+      <w:r>
+        <w:rPr>
+          <w:rFonts w:hint="eastAsia"/>
+        </w:rPr>
+        <w:t>“对还是错”</w:t>
+      </w:r>
+      <w:r>
+        <w:rPr>
+          <w:rFonts w:hint="eastAsia"/>
+        </w:rPr>
+        <w:t>：网络宠物交易乱象的评判</w:t>
       </w:r>
     </w:p>
     <w:p>
@@ -155,7 +294,17 @@
         <w:pStyle w:val="a3"/>
       </w:pPr>
       <w:r>
-        <w:t>从法理上讲，网络宠物交易作为一种依托电子商务开展的商品流通方式，其本身并不为法律所禁止。依法检疫、依法运输、合法经营的宠物交易，属于市场主体的私权自治范畴，受到《民法典》及《电子商务法》的保护。</w:t>
+        <w:t>网络宠物交易作为一种商业模式本身并无对错，但当前普遍存在的“无证寄递”、“盲盒发货”现象，在法理定性上是</w:t>
+      </w:r>
+      <w:r>
+        <w:rPr>
+          <w:b/>
+          <w:bCs/>
+        </w:rPr>
+        <w:t>绝对错误</w:t>
+      </w:r>
+      <w:r>
+        <w:t>的。</w:t>
       </w:r>
     </w:p>
     <w:p>
@@ -163,7 +312,71 @@
         <w:pStyle w:val="a3"/>
       </w:pPr>
       <w:r>
-        <w:t>然而，活体动物属于具有传播疫病风险的特殊客体。因此，网络宠物交易不仅受制于私法规则，更必须绝对服从于动物卫生公法的强制性约束。网购宠物行为合法性的根本前提，在于买卖双方及承运人是否严格履行了国家法定动物防疫义务。</w:t>
+        <w:t>其错误不在于交易从线下转移到了线上，而在于网络经营主体与物流承运人利用数字经济的虚拟性与跨地域性，实施了</w:t>
+      </w:r>
+      <w:r>
+        <w:rPr>
+          <w:b/>
+          <w:bCs/>
+        </w:rPr>
+        <w:t>系统性的法定防疫义务规避</w:t>
+      </w:r>
+      <w:r>
+        <w:t>。这种行为绝非简单的“行业规范不完善”，而是对《中华人民共和国动物防疫法》确立的“预防为主、全链条监管”基本法律制度的实质性破坏。</w:t>
+      </w:r>
+    </w:p>
+    <w:p>
+      <w:pPr>
+        <w:pStyle w:val="a3"/>
+      </w:pPr>
+      <w:r>
+        <w:lastRenderedPageBreak/>
+        <w:t>从动物卫生法制与公共管理的交叉视角来看，该现象的核心之“错”集中体现在以下三个层面：</w:t>
+      </w:r>
+    </w:p>
+    <w:p>
+      <w:pPr>
+        <w:pStyle w:val="a3"/>
+      </w:pPr>
+      <w:r>
+        <w:rPr>
+          <w:b/>
+          <w:bCs/>
+        </w:rPr>
+        <w:t>1. 错在公法义务的私人卸责与成本转嫁</w:t>
+      </w:r>
+      <w:r>
+        <w:t xml:space="preserve"> 动物检疫制度的设立，是为了对抗疫病传播这一“负外部性”风险。法定检疫程序、合规的运输设备都需要付出时间与资金成本。网络商家与违规中介为了压缩商业成本、实现利益最大化，选择放弃检疫申报与合规运输。这在法理上是将本应由经营者承担的“生物安全防范成本”，非法转嫁给了无辜的消费者（承担治疗费用）与全社会（承担疫病爆发风险）。</w:t>
+      </w:r>
+    </w:p>
+    <w:p>
+      <w:pPr>
+        <w:pStyle w:val="a3"/>
+      </w:pPr>
+      <w:r>
+        <w:rPr>
+          <w:b/>
+          <w:bCs/>
+        </w:rPr>
+        <w:t>2. 错在物理隔断了行政监管的追踪链条</w:t>
+      </w:r>
+      <w:r>
+        <w:t xml:space="preserve"> 传统的动物卫生监督依赖于“产地检疫—运输查验—落地报告”的线性闭环。网络宠物交易错在利用电商平台与快递网点的多层嵌套，人为制造了“信息黑箱”。承运人“闭眼收寄”，导致执法部门无法掌握活体动物的真实来源与流向，使得《动物防疫法》赋予行政机关的流行病学调查权与应急处置权在网络交易面前彻底失效。</w:t>
+      </w:r>
+    </w:p>
+    <w:p>
+      <w:pPr>
+        <w:pStyle w:val="a3"/>
+      </w:pPr>
+      <w:r>
+        <w:rPr>
+          <w:b/>
+          <w:bCs/>
+        </w:rPr>
+        <w:t>3. 错在诱发了“劣币驱逐良币”的负面市场效应</w:t>
+      </w:r>
+      <w:r>
+        <w:t xml:space="preserve"> 当违规经营者通过逃避检疫获得低成本优势，且未受到严厉的行政处罚时，其违法收益远大于违法成本。这种现象在客观上惩罚了那些严格按照法规进行疫苗接种、申报检疫、使用专业宠物托运的合规经营者，最终导致整个网络宠物市场陷入法不责众的恶性循环。</w:t>
       </w:r>
     </w:p>
     <w:p/>
@@ -172,7 +385,7 @@
         <w:rPr>
           <w:rFonts w:hint="eastAsia"/>
         </w:rPr>
-        <w:t>从动物卫生法制角度，相应评价；</w:t>
+        <w:t>从动物卫生法制角度，解析原因：对错的原因；</w:t>
       </w:r>
     </w:p>
     <w:p/>
@@ -181,34 +394,11 @@
         <w:rPr>
           <w:rFonts w:hint="eastAsia"/>
         </w:rPr>
-        <w:t>“对还是错”，“对错在哪里”；</w:t>
+        <w:t>从动物卫生法制角度，给出解决方案；</w:t>
       </w:r>
     </w:p>
     <w:p/>
     <w:p>
-      <w:r>
-        <w:rPr>
-          <w:rFonts w:hint="eastAsia"/>
-        </w:rPr>
-        <w:t>从动物卫生法制角度，解析原因：对错的原因；</w:t>
-      </w:r>
-    </w:p>
-    <w:p/>
-    <w:p>
-      <w:r>
-        <w:rPr>
-          <w:rFonts w:hint="eastAsia"/>
-        </w:rPr>
-        <w:t>从动物卫生法制角度，给出解决方案；</w:t>
-      </w:r>
-    </w:p>
-    <w:p/>
-    <w:p>
-      <w:pPr>
-        <w:rPr>
-          <w:rFonts w:hint="eastAsia"/>
-        </w:rPr>
-      </w:pPr>
       <w:r>
         <w:rPr>
           <w:rFonts w:hint="eastAsia"/>
@@ -778,7 +968,6 @@
     <w:name w:val="Normal (Web)"/>
     <w:basedOn w:val="a"/>
     <w:uiPriority w:val="99"/>
-    <w:semiHidden/>
     <w:unhideWhenUsed/>
     <w:rsid w:val="001F7246"/>
     <w:pPr>

</xml_diff>

<commit_message>
vault backup: 2026-06-16 10:32:15
</commit_message>
<xml_diff>
--- a/essay.docx
+++ b/essay.docx
@@ -381,31 +381,851 @@
     </w:p>
     <w:p/>
     <w:p>
-      <w:r>
-        <w:rPr>
-          <w:rFonts w:hint="eastAsia"/>
-        </w:rPr>
-        <w:t>从动物卫生法制角度，解析原因：对错的原因；</w:t>
+      <w:pPr>
+        <w:widowControl/>
+        <w:spacing w:before="100" w:beforeAutospacing="1" w:after="100" w:afterAutospacing="1"/>
+        <w:jc w:val="left"/>
+        <w:outlineLvl w:val="1"/>
+        <w:rPr>
+          <w:rFonts w:ascii="宋体" w:eastAsia="宋体" w:hAnsi="宋体" w:cs="宋体"/>
+          <w:b/>
+          <w:bCs/>
+          <w:kern w:val="0"/>
+          <w:sz w:val="36"/>
+          <w:szCs w:val="36"/>
+        </w:rPr>
+      </w:pPr>
+      <w:r>
+        <w:rPr>
+          <w:rFonts w:ascii="宋体" w:eastAsia="宋体" w:hAnsi="宋体" w:cs="宋体"/>
+          <w:b/>
+          <w:bCs/>
+          <w:kern w:val="0"/>
+          <w:sz w:val="36"/>
+          <w:szCs w:val="36"/>
+        </w:rPr>
+        <w:t>问题产生的法制原因分析：规制失灵与体制瓶颈</w:t>
+      </w:r>
+    </w:p>
+    <w:p>
+      <w:pPr>
+        <w:widowControl/>
+        <w:spacing w:before="100" w:beforeAutospacing="1" w:after="100" w:afterAutospacing="1"/>
+        <w:jc w:val="left"/>
+        <w:rPr>
+          <w:rFonts w:ascii="宋体" w:eastAsia="宋体" w:hAnsi="宋体" w:cs="宋体"/>
+          <w:kern w:val="0"/>
+          <w:sz w:val="24"/>
+          <w:szCs w:val="24"/>
+        </w:rPr>
+      </w:pPr>
+      <w:r>
+        <w:rPr>
+          <w:rFonts w:ascii="宋体" w:eastAsia="宋体" w:hAnsi="宋体" w:cs="宋体"/>
+          <w:kern w:val="0"/>
+          <w:sz w:val="24"/>
+          <w:szCs w:val="24"/>
+        </w:rPr>
+        <w:t>网络宠物交易乱象的长期存在，并非单纯的市场道德败坏，而是传统动物卫生法制在遭遇数字经济冲击时，引发的系统性“规制失灵”与基层执法结构性困境的集中爆发。</w:t>
+      </w:r>
+    </w:p>
+    <w:p>
+      <w:pPr>
+        <w:widowControl/>
+        <w:spacing w:before="100" w:beforeAutospacing="1" w:after="100" w:afterAutospacing="1"/>
+        <w:jc w:val="left"/>
+        <w:outlineLvl w:val="2"/>
+        <w:rPr>
+          <w:rFonts w:ascii="宋体" w:eastAsia="宋体" w:hAnsi="宋体" w:cs="宋体"/>
+          <w:b/>
+          <w:bCs/>
+          <w:kern w:val="0"/>
+          <w:sz w:val="27"/>
+          <w:szCs w:val="27"/>
+        </w:rPr>
+      </w:pPr>
+      <w:r>
+        <w:rPr>
+          <w:rFonts w:ascii="宋体" w:eastAsia="宋体" w:hAnsi="宋体" w:cs="宋体"/>
+          <w:b/>
+          <w:bCs/>
+          <w:kern w:val="0"/>
+          <w:sz w:val="27"/>
+          <w:szCs w:val="27"/>
+        </w:rPr>
+        <w:t>（一）立法层面的“规制失灵”：传统法律框架与数字经济的错位</w:t>
+      </w:r>
+    </w:p>
+    <w:p>
+      <w:pPr>
+        <w:widowControl/>
+        <w:spacing w:before="100" w:beforeAutospacing="1" w:after="100" w:afterAutospacing="1"/>
+        <w:jc w:val="left"/>
+        <w:rPr>
+          <w:rFonts w:ascii="宋体" w:eastAsia="宋体" w:hAnsi="宋体" w:cs="宋体"/>
+          <w:kern w:val="0"/>
+          <w:sz w:val="24"/>
+          <w:szCs w:val="24"/>
+        </w:rPr>
+      </w:pPr>
+      <w:r>
+        <w:rPr>
+          <w:rFonts w:ascii="宋体" w:eastAsia="宋体" w:hAnsi="宋体" w:cs="宋体"/>
+          <w:kern w:val="0"/>
+          <w:sz w:val="24"/>
+          <w:szCs w:val="24"/>
+        </w:rPr>
+        <w:t>现行《中华人民共和国动物防疫法》的立法逻辑，深植于传统的畜禽规模化养殖与线下点对点调运模式。面对高度去中心化的网络宠物交易，传统线性规制手段陷入了明显的失灵状态。</w:t>
+      </w:r>
+    </w:p>
+    <w:p>
+      <w:pPr>
+        <w:widowControl/>
+        <w:numPr>
+          <w:ilvl w:val="0"/>
+          <w:numId w:val="2"/>
+        </w:numPr>
+        <w:spacing w:before="100" w:beforeAutospacing="1" w:after="100" w:afterAutospacing="1"/>
+        <w:jc w:val="left"/>
+        <w:rPr>
+          <w:rFonts w:ascii="宋体" w:eastAsia="宋体" w:hAnsi="宋体" w:cs="宋体"/>
+          <w:kern w:val="0"/>
+          <w:sz w:val="24"/>
+          <w:szCs w:val="24"/>
+        </w:rPr>
+      </w:pPr>
+      <w:r>
+        <w:rPr>
+          <w:rFonts w:ascii="宋体" w:eastAsia="宋体" w:hAnsi="宋体" w:cs="宋体"/>
+          <w:b/>
+          <w:bCs/>
+          <w:kern w:val="0"/>
+          <w:sz w:val="24"/>
+          <w:szCs w:val="24"/>
+        </w:rPr>
+        <w:t>规制对象的碎片化与检疫标准的滞后</w:t>
+      </w:r>
+    </w:p>
+    <w:p>
+      <w:pPr>
+        <w:widowControl/>
+        <w:spacing w:before="100" w:beforeAutospacing="1" w:after="100" w:afterAutospacing="1"/>
+        <w:ind w:left="720"/>
+        <w:jc w:val="left"/>
+        <w:rPr>
+          <w:rFonts w:ascii="宋体" w:eastAsia="宋体" w:hAnsi="宋体" w:cs="宋体"/>
+          <w:kern w:val="0"/>
+          <w:sz w:val="24"/>
+          <w:szCs w:val="24"/>
+        </w:rPr>
+      </w:pPr>
+      <w:r>
+        <w:rPr>
+          <w:rFonts w:ascii="宋体" w:eastAsia="宋体" w:hAnsi="宋体" w:cs="宋体"/>
+          <w:kern w:val="0"/>
+          <w:sz w:val="24"/>
+          <w:szCs w:val="24"/>
+        </w:rPr>
+        <w:t>传统产地检疫主要针对集中出栏的农畜产品。而网络宠物交易呈现出明显的“散、小、多”特征，交易主体多为个人繁育者或小型犬猫舍。现行法律对于这种碎片化的“C2C”或“B2C”零散发货模式，缺乏低成本、高效率的专项检疫申报路径，导致守法成本过高，客观上“倒逼”部分商户选择非法规避。</w:t>
+      </w:r>
+    </w:p>
+    <w:p>
+      <w:pPr>
+        <w:widowControl/>
+        <w:numPr>
+          <w:ilvl w:val="0"/>
+          <w:numId w:val="2"/>
+        </w:numPr>
+        <w:spacing w:before="100" w:beforeAutospacing="1" w:after="100" w:afterAutospacing="1"/>
+        <w:jc w:val="left"/>
+        <w:rPr>
+          <w:rFonts w:ascii="宋体" w:eastAsia="宋体" w:hAnsi="宋体" w:cs="宋体"/>
+          <w:kern w:val="0"/>
+          <w:sz w:val="24"/>
+          <w:szCs w:val="24"/>
+        </w:rPr>
+      </w:pPr>
+      <w:r>
+        <w:rPr>
+          <w:rFonts w:ascii="宋体" w:eastAsia="宋体" w:hAnsi="宋体" w:cs="宋体"/>
+          <w:b/>
+          <w:bCs/>
+          <w:kern w:val="0"/>
+          <w:sz w:val="24"/>
+          <w:szCs w:val="24"/>
+        </w:rPr>
+        <w:lastRenderedPageBreak/>
+        <w:t>“网络守门人”法定协同责任的缺位</w:t>
+      </w:r>
+    </w:p>
+    <w:p>
+      <w:pPr>
+        <w:widowControl/>
+        <w:spacing w:before="100" w:beforeAutospacing="1" w:after="100" w:afterAutospacing="1"/>
+        <w:ind w:left="720"/>
+        <w:jc w:val="left"/>
+        <w:rPr>
+          <w:rFonts w:ascii="宋体" w:eastAsia="宋体" w:hAnsi="宋体" w:cs="宋体"/>
+          <w:kern w:val="0"/>
+          <w:sz w:val="24"/>
+          <w:szCs w:val="24"/>
+        </w:rPr>
+      </w:pPr>
+      <w:r>
+        <w:rPr>
+          <w:rFonts w:ascii="宋体" w:eastAsia="宋体" w:hAnsi="宋体" w:cs="宋体"/>
+          <w:kern w:val="0"/>
+          <w:sz w:val="24"/>
+          <w:szCs w:val="24"/>
+        </w:rPr>
+        <w:t>在数字经济环境下，电商平台是控制交易流向的枢纽。正如刘大洪等（2021）在论述电子商务平台“网络守门人”责任时所指出的，当行政机关面对海量线上主体导致监管成本激增时，必须引入平台的协同规制（刘大洪等，2021）。然而，现行《动物防疫法》尚未与《电子商务法》形成有效衔接，未将“官方动物检疫证明”列为活体商家上架的法定强制核验要件。平台往往以“避风港原则”推脱责任，客观上为非法交易提供了庇护所。</w:t>
+      </w:r>
+    </w:p>
+    <w:p>
+      <w:pPr>
+        <w:widowControl/>
+        <w:spacing w:before="100" w:beforeAutospacing="1" w:after="100" w:afterAutospacing="1"/>
+        <w:jc w:val="left"/>
+        <w:outlineLvl w:val="2"/>
+        <w:rPr>
+          <w:rFonts w:ascii="宋体" w:eastAsia="宋体" w:hAnsi="宋体" w:cs="宋体"/>
+          <w:b/>
+          <w:bCs/>
+          <w:kern w:val="0"/>
+          <w:sz w:val="27"/>
+          <w:szCs w:val="27"/>
+        </w:rPr>
+      </w:pPr>
+      <w:r>
+        <w:rPr>
+          <w:rFonts w:ascii="宋体" w:eastAsia="宋体" w:hAnsi="宋体" w:cs="宋体"/>
+          <w:b/>
+          <w:bCs/>
+          <w:kern w:val="0"/>
+          <w:sz w:val="27"/>
+          <w:szCs w:val="27"/>
+        </w:rPr>
+        <w:t>（二）体制结构瓶颈：“街头官僚”的容量危机与权责断层</w:t>
+      </w:r>
+    </w:p>
+    <w:p>
+      <w:pPr>
+        <w:widowControl/>
+        <w:spacing w:before="100" w:beforeAutospacing="1" w:after="100" w:afterAutospacing="1"/>
+        <w:jc w:val="left"/>
+        <w:rPr>
+          <w:rFonts w:ascii="宋体" w:eastAsia="宋体" w:hAnsi="宋体" w:cs="宋体"/>
+          <w:kern w:val="0"/>
+          <w:sz w:val="24"/>
+          <w:szCs w:val="24"/>
+        </w:rPr>
+      </w:pPr>
+      <w:r>
+        <w:rPr>
+          <w:rFonts w:ascii="宋体" w:eastAsia="宋体" w:hAnsi="宋体" w:cs="宋体"/>
+          <w:kern w:val="0"/>
+          <w:sz w:val="24"/>
+          <w:szCs w:val="24"/>
+        </w:rPr>
+        <w:t>在基层动物卫生监督的末端，执法资源匮乏与激增的监管任务之间存在着不可调和的矛盾。根据韩志明（2018）阐释的“街头官僚”理论，一线行政执法者在面临系统性资源约束与任务超载时，往往被迫采取“适应性策略”或选择性执法（韩志明，2018）。</w:t>
+      </w:r>
+    </w:p>
+    <w:p>
+      <w:pPr>
+        <w:widowControl/>
+        <w:numPr>
+          <w:ilvl w:val="0"/>
+          <w:numId w:val="3"/>
+        </w:numPr>
+        <w:spacing w:before="100" w:beforeAutospacing="1" w:after="100" w:afterAutospacing="1"/>
+        <w:jc w:val="left"/>
+        <w:rPr>
+          <w:rFonts w:ascii="宋体" w:eastAsia="宋体" w:hAnsi="宋体" w:cs="宋体"/>
+          <w:kern w:val="0"/>
+          <w:sz w:val="24"/>
+          <w:szCs w:val="24"/>
+        </w:rPr>
+      </w:pPr>
+      <w:r>
+        <w:rPr>
+          <w:rFonts w:ascii="宋体" w:eastAsia="宋体" w:hAnsi="宋体" w:cs="宋体"/>
+          <w:b/>
+          <w:bCs/>
+          <w:kern w:val="0"/>
+          <w:sz w:val="24"/>
+          <w:szCs w:val="24"/>
+        </w:rPr>
+        <w:t>检疫业务激增与“小马拉大车”的容量极限</w:t>
+      </w:r>
+      <w:r>
+        <w:rPr>
+          <w:rFonts w:ascii="宋体" w:eastAsia="宋体" w:hAnsi="宋体" w:cs="宋体"/>
+          <w:kern w:val="0"/>
+          <w:sz w:val="24"/>
+          <w:szCs w:val="24"/>
+        </w:rPr>
+        <w:t xml:space="preserve"> 随着畜牧业规模化及互联网流通的发展，基层动物检疫业务量本身就在持续爆发。以云南省腾冲市为例，仅2021-2025年间，基层需应对的畜禽及各类动物检疫数量极为庞大且种类复杂，激增的工作量直接推高了误检或漏检的系统性风险。在此高压常态下，基层官方兽医仅应对传统畜牧业的检疫申报已捉襟见肘，根本无力抽身对隐蔽、分散的网络宠物繁育暗流实施主动摸排。 </w:t>
+      </w:r>
+    </w:p>
+    <w:p>
+      <w:pPr>
+        <w:widowControl/>
+        <w:numPr>
+          <w:ilvl w:val="0"/>
+          <w:numId w:val="3"/>
+        </w:numPr>
+        <w:spacing w:before="100" w:beforeAutospacing="1" w:after="100" w:afterAutospacing="1"/>
+        <w:jc w:val="left"/>
+        <w:rPr>
+          <w:rFonts w:ascii="宋体" w:eastAsia="宋体" w:hAnsi="宋体" w:cs="宋体"/>
+          <w:kern w:val="0"/>
+          <w:sz w:val="24"/>
+          <w:szCs w:val="24"/>
+        </w:rPr>
+      </w:pPr>
+      <w:r>
+        <w:rPr>
+          <w:rFonts w:ascii="宋体" w:eastAsia="宋体" w:hAnsi="宋体" w:cs="宋体"/>
+          <w:b/>
+          <w:bCs/>
+          <w:kern w:val="0"/>
+          <w:sz w:val="24"/>
+          <w:szCs w:val="24"/>
+        </w:rPr>
+        <w:t>基层体制改革引发的“权责相悖”</w:t>
+      </w:r>
+    </w:p>
+    <w:p>
+      <w:pPr>
+        <w:widowControl/>
+        <w:spacing w:before="100" w:beforeAutospacing="1" w:after="100" w:afterAutospacing="1"/>
+        <w:ind w:left="720"/>
+        <w:jc w:val="left"/>
+        <w:rPr>
+          <w:rFonts w:ascii="宋体" w:eastAsia="宋体" w:hAnsi="宋体" w:cs="宋体"/>
+          <w:kern w:val="0"/>
+          <w:sz w:val="24"/>
+          <w:szCs w:val="24"/>
+        </w:rPr>
+      </w:pPr>
+      <w:r>
+        <w:rPr>
+          <w:rFonts w:ascii="宋体" w:eastAsia="宋体" w:hAnsi="宋体" w:cs="宋体"/>
+          <w:kern w:val="0"/>
+          <w:sz w:val="24"/>
+          <w:szCs w:val="24"/>
+        </w:rPr>
+        <w:t>近年来，部分地区推行基层执法体制改革。据刘顺能等（2026）在文山州的实证调研发现，原由乡镇承担的动物检疫行政职能统一上划至县级农业农村主管部门后，县级机构面临“小马拉大车”的系统性挑战（刘顺能等，2026）。与此同时，直面网络宠物繁育第一线的乡镇防疫机构，却因职能剥离而陷入“权责相悖”的境地——“看得见的管不着，管得着的看不见”。这种双重错位导致了基层监管网络的物理断裂。</w:t>
+      </w:r>
+    </w:p>
+    <w:p>
+      <w:pPr>
+        <w:widowControl/>
+        <w:spacing w:before="100" w:beforeAutospacing="1" w:after="100" w:afterAutospacing="1"/>
+        <w:jc w:val="left"/>
+        <w:outlineLvl w:val="2"/>
+        <w:rPr>
+          <w:rFonts w:ascii="宋体" w:eastAsia="宋体" w:hAnsi="宋体" w:cs="宋体"/>
+          <w:b/>
+          <w:bCs/>
+          <w:kern w:val="0"/>
+          <w:sz w:val="27"/>
+          <w:szCs w:val="27"/>
+        </w:rPr>
+      </w:pPr>
+      <w:r>
+        <w:rPr>
+          <w:rFonts w:ascii="宋体" w:eastAsia="宋体" w:hAnsi="宋体" w:cs="宋体"/>
+          <w:b/>
+          <w:bCs/>
+          <w:kern w:val="0"/>
+          <w:sz w:val="27"/>
+          <w:szCs w:val="27"/>
+        </w:rPr>
+        <w:t>（三）协同执法的法制壁垒：跨地域与跨部门的“数据孤岛”</w:t>
+      </w:r>
+    </w:p>
+    <w:p>
+      <w:pPr>
+        <w:widowControl/>
+        <w:spacing w:before="100" w:beforeAutospacing="1" w:after="100" w:afterAutospacing="1"/>
+        <w:jc w:val="left"/>
+        <w:rPr>
+          <w:rFonts w:ascii="宋体" w:eastAsia="宋体" w:hAnsi="宋体" w:cs="宋体"/>
+          <w:kern w:val="0"/>
+          <w:sz w:val="24"/>
+          <w:szCs w:val="24"/>
+        </w:rPr>
+      </w:pPr>
+      <w:r>
+        <w:rPr>
+          <w:rFonts w:ascii="宋体" w:eastAsia="宋体" w:hAnsi="宋体" w:cs="宋体"/>
+          <w:kern w:val="0"/>
+          <w:sz w:val="24"/>
+          <w:szCs w:val="24"/>
+        </w:rPr>
+        <w:t>网络活体宠物交易天然具有跨越物理边界的属性，这与我国现行的动物卫生行政监管体制产生了剧烈摩擦。</w:t>
+      </w:r>
+    </w:p>
+    <w:p>
+      <w:pPr>
+        <w:widowControl/>
+        <w:numPr>
+          <w:ilvl w:val="0"/>
+          <w:numId w:val="4"/>
+        </w:numPr>
+        <w:spacing w:before="100" w:beforeAutospacing="1" w:after="100" w:afterAutospacing="1"/>
+        <w:jc w:val="left"/>
+        <w:rPr>
+          <w:rFonts w:ascii="宋体" w:eastAsia="宋体" w:hAnsi="宋体" w:cs="宋体"/>
+          <w:kern w:val="0"/>
+          <w:sz w:val="24"/>
+          <w:szCs w:val="24"/>
+        </w:rPr>
+      </w:pPr>
+      <w:r>
+        <w:rPr>
+          <w:rFonts w:ascii="宋体" w:eastAsia="宋体" w:hAnsi="宋体" w:cs="宋体"/>
+          <w:b/>
+          <w:bCs/>
+          <w:kern w:val="0"/>
+          <w:sz w:val="24"/>
+          <w:szCs w:val="24"/>
+        </w:rPr>
+        <w:t>“属地管辖”对抗“跨域流通”的取证困境</w:t>
+      </w:r>
+    </w:p>
+    <w:p>
+      <w:pPr>
+        <w:widowControl/>
+        <w:spacing w:before="100" w:beforeAutospacing="1" w:after="100" w:afterAutospacing="1"/>
+        <w:ind w:left="720"/>
+        <w:jc w:val="left"/>
+        <w:rPr>
+          <w:rFonts w:ascii="宋体" w:eastAsia="宋体" w:hAnsi="宋体" w:cs="宋体"/>
+          <w:kern w:val="0"/>
+          <w:sz w:val="24"/>
+          <w:szCs w:val="24"/>
+        </w:rPr>
+      </w:pPr>
+      <w:r>
+        <w:rPr>
+          <w:rFonts w:ascii="宋体" w:eastAsia="宋体" w:hAnsi="宋体" w:cs="宋体"/>
+          <w:kern w:val="0"/>
+          <w:sz w:val="24"/>
+          <w:szCs w:val="24"/>
+        </w:rPr>
+        <w:t>违规寄递的宠物往往卖家在A省，经由B省物流中转，最终到达C省买家手中。这种分离式交易使得坚持“属地管辖”原则的地方农业执法队伍面临极大的异地调查与取证壁垒，导致违法行为难以被全链条追溯。</w:t>
+      </w:r>
+    </w:p>
+    <w:p>
+      <w:pPr>
+        <w:widowControl/>
+        <w:numPr>
+          <w:ilvl w:val="0"/>
+          <w:numId w:val="4"/>
+        </w:numPr>
+        <w:spacing w:before="100" w:beforeAutospacing="1" w:after="100" w:afterAutospacing="1"/>
+        <w:jc w:val="left"/>
+        <w:rPr>
+          <w:rFonts w:ascii="宋体" w:eastAsia="宋体" w:hAnsi="宋体" w:cs="宋体"/>
+          <w:kern w:val="0"/>
+          <w:sz w:val="24"/>
+          <w:szCs w:val="24"/>
+        </w:rPr>
+      </w:pPr>
+      <w:r>
+        <w:rPr>
+          <w:rFonts w:ascii="宋体" w:eastAsia="宋体" w:hAnsi="宋体" w:cs="宋体"/>
+          <w:b/>
+          <w:bCs/>
+          <w:kern w:val="0"/>
+          <w:sz w:val="24"/>
+          <w:szCs w:val="24"/>
+        </w:rPr>
+        <w:lastRenderedPageBreak/>
+        <w:t>多头管理下的部门协同阻滞</w:t>
+      </w:r>
+      <w:r>
+        <w:rPr>
+          <w:rFonts w:ascii="宋体" w:eastAsia="宋体" w:hAnsi="宋体" w:cs="宋体"/>
+          <w:kern w:val="0"/>
+          <w:sz w:val="24"/>
+          <w:szCs w:val="24"/>
+        </w:rPr>
+        <w:t xml:space="preserve"> 动物防疫检疫工作横跨多个行政管理领域，但在实际执行中，部门间协作往往流于形式，多头管理与监管盲区并存。目前，农业农村部门（管检疫）、邮政管理部门（管快递）、市场监管部门（管平台）之间缺乏法定的数据强制共享机制。农业部门的检疫数据无法实时推送给物流企业进行自动拦截，致使《动物防疫法》规定的“承运人查验责任”因缺乏技术接口而沦为空谈。 </w:t>
+      </w:r>
+    </w:p>
+    <w:p>
+      <w:pPr>
+        <w:widowControl/>
+        <w:spacing w:before="100" w:beforeAutospacing="1" w:after="100" w:afterAutospacing="1"/>
+        <w:jc w:val="left"/>
+        <w:outlineLvl w:val="2"/>
+        <w:rPr>
+          <w:rFonts w:ascii="宋体" w:eastAsia="宋体" w:hAnsi="宋体" w:cs="宋体"/>
+          <w:b/>
+          <w:bCs/>
+          <w:kern w:val="0"/>
+          <w:sz w:val="27"/>
+          <w:szCs w:val="27"/>
+        </w:rPr>
+      </w:pPr>
+      <w:r>
+        <w:rPr>
+          <w:rFonts w:ascii="宋体" w:eastAsia="宋体" w:hAnsi="宋体" w:cs="宋体"/>
+          <w:b/>
+          <w:bCs/>
+          <w:kern w:val="0"/>
+          <w:sz w:val="27"/>
+          <w:szCs w:val="27"/>
+        </w:rPr>
+        <w:t>（四）违法成本与规制威慑力的失衡</w:t>
+      </w:r>
+    </w:p>
+    <w:p>
+      <w:pPr>
+        <w:widowControl/>
+        <w:spacing w:before="100" w:beforeAutospacing="1" w:after="100" w:afterAutospacing="1"/>
+        <w:jc w:val="left"/>
+        <w:rPr>
+          <w:rFonts w:ascii="宋体" w:eastAsia="宋体" w:hAnsi="宋体" w:cs="宋体"/>
+          <w:kern w:val="0"/>
+          <w:sz w:val="24"/>
+          <w:szCs w:val="24"/>
+        </w:rPr>
+      </w:pPr>
+      <w:r>
+        <w:rPr>
+          <w:rFonts w:ascii="宋体" w:eastAsia="宋体" w:hAnsi="宋体" w:cs="宋体"/>
+          <w:kern w:val="0"/>
+          <w:sz w:val="24"/>
+          <w:szCs w:val="24"/>
+        </w:rPr>
+        <w:t>网络宠物交易中存在严重的“违法收益极高，而违法成本极低”的倒挂现象。由于单笔活体交易金额通常较小，即便被执法部门偶发性查处，其行政罚款金额远低于其长期逃避检疫、违规运输所省下的制度成本。长效信用惩戒机制的缺位，使得传统行政处罚无法在庞大的网络市场中形成有效威慑。</w:t>
+      </w:r>
+    </w:p>
+    <w:p>
+      <w:pPr>
+        <w:pStyle w:val="2"/>
+      </w:pPr>
+      <w:r>
+        <w:t>五、 动物卫生法制视角下的治理路径与制度重构</w:t>
+      </w:r>
+    </w:p>
+    <w:p>
+      <w:pPr>
+        <w:pStyle w:val="a3"/>
+      </w:pPr>
+      <w:r>
+        <w:t>针对网络宠物交易中暴露出的规制失灵与体制瓶颈，单纯依靠增加基层兽医编制或开展短期“运动式执法”已无法触及病灶。必须实现从“线下人工盯防”向“全链条数字治理”的法治范式转型，构建“法律授权—技术赋能—部门协同”的治理闭环。</w:t>
+      </w:r>
+    </w:p>
+    <w:p>
+      <w:pPr>
+        <w:pStyle w:val="3"/>
+      </w:pPr>
+      <w:r>
+        <w:t>（一）完善电子商务与动物防疫的法律衔接，压实“守门人”责任</w:t>
+      </w:r>
+    </w:p>
+    <w:p>
+      <w:pPr>
+        <w:pStyle w:val="a3"/>
+      </w:pPr>
+      <w:r>
+        <w:t>打破网络交易“规制失灵”的核心，在于赋予电商平台强制性的协管义务，切断未经检疫宠物的线上展示与交易渠道。</w:t>
+      </w:r>
+    </w:p>
+    <w:p>
+      <w:pPr>
+        <w:pStyle w:val="a3"/>
+        <w:numPr>
+          <w:ilvl w:val="0"/>
+          <w:numId w:val="5"/>
+        </w:numPr>
+      </w:pPr>
+      <w:r>
+        <w:rPr>
+          <w:b/>
+          <w:bCs/>
+        </w:rPr>
+        <w:t>确立平台前置审核义务</w:t>
+      </w:r>
+      <w:r>
+        <w:t>：在《动物防疫法》或《电子商务法》的后续实施条例中，明确将“官方动物检疫合格证明”作为活体动物（含异宠）网络上架的法定前置要件。</w:t>
+      </w:r>
+    </w:p>
+    <w:p>
+      <w:pPr>
+        <w:pStyle w:val="a3"/>
+        <w:numPr>
+          <w:ilvl w:val="0"/>
+          <w:numId w:val="5"/>
+        </w:numPr>
+      </w:pPr>
+      <w:r>
+        <w:rPr>
+          <w:b/>
+          <w:bCs/>
+        </w:rPr>
+        <w:t>建立违规商家清退机制</w:t>
+      </w:r>
+      <w:r>
+        <w:t>：要求平台对无法提供检疫证明、伪造证明或因违规运输引发重大死亡事件的商户，实施断开链接、封禁账号等处置，并将线索依法移交农业综合行政执法部门。</w:t>
+      </w:r>
+    </w:p>
+    <w:p>
+      <w:pPr>
+        <w:pStyle w:val="3"/>
+      </w:pPr>
+      <w:r>
+        <w:t>（二）依托数字监管突破“街头官僚”的执法容量瓶颈</w:t>
+      </w:r>
+    </w:p>
+    <w:p>
+      <w:pPr>
+        <w:pStyle w:val="a3"/>
+      </w:pPr>
+      <w:r>
+        <w:t>针对基层“小马拉大车”的体制困境，应当通过技术赋能，以算法规制替代部分人工核验，降低执法成本。</w:t>
+      </w:r>
+    </w:p>
+    <w:p>
+      <w:pPr>
+        <w:pStyle w:val="a3"/>
+        <w:numPr>
+          <w:ilvl w:val="0"/>
+          <w:numId w:val="6"/>
+        </w:numPr>
+      </w:pPr>
+      <w:r>
+        <w:rPr>
+          <w:b/>
+          <w:bCs/>
+        </w:rPr>
+        <w:t>全面推行检疫证明电子化与API联网</w:t>
+      </w:r>
+      <w:r>
+        <w:t>：废止易被伪造的纸质检疫证明，全面推行附带区块链存证与动态二维码的“电子检疫证明”。</w:t>
+      </w:r>
+    </w:p>
+    <w:p>
+      <w:pPr>
+        <w:pStyle w:val="a3"/>
+        <w:numPr>
+          <w:ilvl w:val="0"/>
+          <w:numId w:val="6"/>
+        </w:numPr>
+      </w:pPr>
+      <w:r>
+        <w:rPr>
+          <w:b/>
+          <w:bCs/>
+        </w:rPr>
+        <w:lastRenderedPageBreak/>
+        <w:t>引入智能合规审查机制</w:t>
+      </w:r>
+      <w:r>
+        <w:t>：结合大语言模型（LLM）与检索增强生成（RAG）技术，在监管端开发“智能动物卫生合规Agent”。该系统可自动抓取电商平台的活体交易报表与电子检疫证，实时比对产地疫病风险等级与动物种类信息，一旦发现证件造假或高风险疫区调运，自动向基层执法终端发送预警，实现从“被动响应”向“精准靶向执法”的跨越。</w:t>
+      </w:r>
+    </w:p>
+    <w:p>
+      <w:pPr>
+        <w:pStyle w:val="3"/>
+      </w:pPr>
+      <w:r>
+        <w:t>（三）构建跨部门数据共享与信用惩戒机制</w:t>
+      </w:r>
+    </w:p>
+    <w:p>
+      <w:pPr>
+        <w:pStyle w:val="a3"/>
+      </w:pPr>
+      <w:r>
+        <w:t>打破“属地管辖”与多头管理的壁垒，重塑网络活体流通的监管链条。</w:t>
+      </w:r>
+    </w:p>
+    <w:p>
+      <w:pPr>
+        <w:pStyle w:val="a3"/>
+        <w:numPr>
+          <w:ilvl w:val="0"/>
+          <w:numId w:val="7"/>
+        </w:numPr>
+      </w:pPr>
+      <w:r>
+        <w:rPr>
+          <w:b/>
+          <w:bCs/>
+        </w:rPr>
+        <w:t>建立“农业+邮政+市场监管”联合执法接口</w:t>
+      </w:r>
+      <w:r>
+        <w:t>：强制打通部门间的数据孤岛。农业农村部门的电子检疫数据必须向邮政管理部门开放接口。快递企业在揽收活体动物时，其终端扫码枪必须能直接校验检疫码，无码或扫码显示无效的，系统前端直接锁死，从技术上强制落实《动物防疫法》的承运人查验责任。</w:t>
+      </w:r>
+    </w:p>
+    <w:p>
+      <w:pPr>
+        <w:pStyle w:val="a3"/>
+        <w:numPr>
+          <w:ilvl w:val="0"/>
+          <w:numId w:val="7"/>
+        </w:numPr>
+      </w:pPr>
+      <w:r>
+        <w:rPr>
+          <w:b/>
+          <w:bCs/>
+        </w:rPr>
+        <w:t>实施信用联合惩戒</w:t>
+      </w:r>
+      <w:r>
+        <w:t>：提高违法成本。对屡次逃避检疫、违规寄递活体动物的托运中介及繁育者，列入动物卫生监督失信黑名单，并限制其使用主流快递网络与电商平台。</w:t>
+      </w:r>
+    </w:p>
+    <w:p>
+      <w:pPr>
+        <w:pStyle w:val="3"/>
+      </w:pPr>
+      <w:r>
+        <w:t>（四）细化活体动物运输的法定卫生与福利标准</w:t>
+      </w:r>
+    </w:p>
+    <w:p>
+      <w:pPr>
+        <w:pStyle w:val="a3"/>
+      </w:pPr>
+      <w:r>
+        <w:t>填补“盲盒运输”的法律真空，将动物福利诉求转化为可执行的行政卫生标准。</w:t>
+      </w:r>
+    </w:p>
+    <w:p>
+      <w:pPr>
+        <w:pStyle w:val="a3"/>
+        <w:numPr>
+          <w:ilvl w:val="0"/>
+          <w:numId w:val="8"/>
+        </w:numPr>
+      </w:pPr>
+      <w:r>
+        <w:rPr>
+          <w:b/>
+          <w:bCs/>
+        </w:rPr>
+        <w:t>出台专门的网络活体动物寄递防疫规范</w:t>
+      </w:r>
+      <w:r>
+        <w:t>：以部门规章形式，明确不同种类宠物（如犬猫、爬行类、禽类）运输过程中的空间密度、温度控制、通风换气及最长运输时长等强制性量化标准。</w:t>
+      </w:r>
+    </w:p>
+    <w:p>
+      <w:pPr>
+        <w:pStyle w:val="a3"/>
+        <w:numPr>
+          <w:ilvl w:val="0"/>
+          <w:numId w:val="8"/>
+        </w:numPr>
+      </w:pPr>
+      <w:r>
+        <w:rPr>
+          <w:b/>
+          <w:bCs/>
+        </w:rPr>
+        <w:t>强化承运设备准入</w:t>
+      </w:r>
+      <w:r>
+        <w:t>：禁止使用不具备生命保障与卫生消毒条件的普通厢式货车混装寄递活体动物，倒逼物流行业设立专业的活体动物运输业务线。</w:t>
+      </w:r>
+    </w:p>
+    <w:p>
+      <w:pPr>
+        <w:pStyle w:val="2"/>
+      </w:pPr>
+      <w:r>
+        <w:t>六、 挑战、启示与展望</w:t>
+      </w:r>
+    </w:p>
+    <w:p>
+      <w:pPr>
+        <w:pStyle w:val="3"/>
+      </w:pPr>
+      <w:r>
+        <w:t>（一）未来监管面临的挑战</w:t>
+      </w:r>
+    </w:p>
+    <w:p>
+      <w:pPr>
+        <w:pStyle w:val="a3"/>
+      </w:pPr>
+      <w:r>
+        <w:t>在推进数字治理的过程中，我们仍需警惕潜在的法制风险与现实挑战：</w:t>
+      </w:r>
+    </w:p>
+    <w:p>
+      <w:pPr>
+        <w:pStyle w:val="a3"/>
+        <w:numPr>
+          <w:ilvl w:val="0"/>
+          <w:numId w:val="9"/>
+        </w:numPr>
+      </w:pPr>
+      <w:r>
+        <w:rPr>
+          <w:b/>
+          <w:bCs/>
+        </w:rPr>
+        <w:t>“算法黑箱”与行政救济</w:t>
+      </w:r>
+      <w:r>
+        <w:t>：当自动化系统（如合规Agent）错误拦截合规商家的交易时，如何保障行政相对人的申诉与救济渠道。</w:t>
+      </w:r>
+    </w:p>
+    <w:p>
+      <w:pPr>
+        <w:pStyle w:val="a3"/>
+        <w:numPr>
+          <w:ilvl w:val="0"/>
+          <w:numId w:val="9"/>
+        </w:numPr>
+      </w:pPr>
+      <w:r>
+        <w:rPr>
+          <w:b/>
+          <w:bCs/>
+        </w:rPr>
+        <w:lastRenderedPageBreak/>
+        <w:t>发展不平衡</w:t>
+      </w:r>
+      <w:r>
+        <w:t>：中西部偏远乡镇在推行电子检疫系统与智能终端时，可能因基础设施落后而产生新的“监管鸿沟”。</w:t>
+      </w:r>
+    </w:p>
+    <w:p>
+      <w:pPr>
+        <w:pStyle w:val="3"/>
+      </w:pPr>
+      <w:r>
+        <w:t>（二）启示与展望</w:t>
+      </w:r>
+    </w:p>
+    <w:p>
+      <w:pPr>
+        <w:pStyle w:val="a3"/>
+      </w:pPr>
+      <w:r>
+        <w:t>网络宠物交易暴露出的乱象，是对传统动物卫生法制体系的一次极限压力测试。它给我们的深刻启示在于：在数字经济时代，动物卫生法制建设绝不能固步自封于农场与屠宰场的围墙之内。</w:t>
+      </w:r>
+    </w:p>
+    <w:p>
+      <w:pPr>
+        <w:pStyle w:val="a3"/>
+      </w:pPr>
+      <w:r>
+        <w:t>未来，动物卫生监管的演进方向必然是构建“繁育—检疫—网络销售—运输—终端消费”全数据链条的智慧防控体系。只有将《动物防疫法》的刚性约束力无缝嵌入电子商务与现代物流的代码与流程中，才能在保护公共卫生安全与促进新型宠物产业发展之间，找到真正的法治平衡。</w:t>
       </w:r>
     </w:p>
     <w:p/>
-    <w:p>
-      <w:r>
-        <w:rPr>
-          <w:rFonts w:hint="eastAsia"/>
-        </w:rPr>
-        <w:t>从动物卫生法制角度，给出解决方案；</w:t>
-      </w:r>
-    </w:p>
-    <w:p/>
-    <w:p>
-      <w:r>
-        <w:rPr>
-          <w:rFonts w:hint="eastAsia"/>
-        </w:rPr>
-        <w:t>讨论挑战，启示和展望。</w:t>
-      </w:r>
-    </w:p>
     <w:sectPr>
       <w:pgSz w:w="11906" w:h="16838"/>
       <w:pgMar w:top="1440" w:right="1800" w:bottom="1440" w:left="1800" w:header="851" w:footer="992" w:gutter="0"/>
@@ -419,6 +1239,684 @@
 <file path=word/numbering.xml><?xml version="1.0" encoding="utf-8"?>
 <w:numbering xmlns:wpc="http://schemas.microsoft.com/office/word/2010/wordprocessingCanvas" xmlns:cx="http://schemas.microsoft.com/office/drawing/2014/chartex" xmlns:cx1="http://schemas.microsoft.com/office/drawing/2015/9/8/chartex" xmlns:cx2="http://schemas.microsoft.com/office/drawing/2015/10/21/chartex" xmlns:cx3="http://schemas.microsoft.com/office/drawing/2016/5/9/chartex" xmlns:cx4="http://schemas.microsoft.com/office/drawing/2016/5/10/chartex" xmlns:cx5="http://schemas.microsoft.com/office/drawing/2016/5/11/chartex" xmlns:cx6="http://schemas.microsoft.com/office/drawing/2016/5/12/chartex" xmlns:cx7="http://schemas.microsoft.com/office/drawing/2016/5/13/chartex" xmlns:cx8="http://schemas.microsoft.com/office/drawing/2016/5/14/chartex" xmlns:mc="http://schemas.openxmlformats.org/markup-compatibility/2006" xmlns:aink="http://schemas.microsoft.com/office/drawing/2016/ink" xmlns:am3d="http://schemas.microsoft.com/office/drawing/2017/model3d" xmlns:o="urn:schemas-microsoft-com:office:office" xmlns:r="http://schemas.openxmlformats.org/officeDocument/2006/relationships" xmlns:m="http://schemas.openxmlformats.org/officeDocument/2006/math" xmlns:v="urn:schemas-microsoft-com:vml" xmlns:wp14="http://schemas.microsoft.com/office/word/2010/wordprocessingDrawing" xmlns:wp="http://schemas.openxmlformats.org/drawingml/2006/wordprocessingDrawing" xmlns:w10="urn:schemas-microsoft-com:office:word" xmlns:w="http://schemas.openxmlformats.org/wordprocessingml/2006/main" xmlns:w14="http://schemas.microsoft.com/office/word/2010/wordml" xmlns:w15="http://schemas.microsoft.com/office/word/2012/wordml" xmlns:w16cex="http://schemas.microsoft.com/office/word/2018/wordml/cex" xmlns:w16cid="http://schemas.microsoft.com/office/word/2016/wordml/cid" xmlns:w16="http://schemas.microsoft.com/office/word/2018/wordml" xmlns:w16sdtdh="http://schemas.microsoft.com/office/word/2020/wordml/sdtdatahash" xmlns:w16se="http://schemas.microsoft.com/office/word/2015/wordml/symex" xmlns:wpg="http://schemas.microsoft.com/office/word/2010/wordprocessingGroup" xmlns:wpi="http://schemas.microsoft.com/office/word/2010/wordprocessingInk" xmlns:wne="http://schemas.microsoft.com/office/word/2006/wordml" xmlns:wps="http://schemas.microsoft.com/office/word/2010/wordprocessingShape" mc:Ignorable="w14 w15 w16se w16cid w16 w16cex w16sdtdh wp14">
   <w:abstractNum w:abstractNumId="0" w15:restartNumberingAfterBreak="0">
+    <w:nsid w:val="07E502A7"/>
+    <w:multiLevelType w:val="multilevel"/>
+    <w:tmpl w:val="CC7C2F9C"/>
+    <w:lvl w:ilvl="0">
+      <w:start w:val="1"/>
+      <w:numFmt w:val="decimal"/>
+      <w:lvlText w:val="%1."/>
+      <w:lvlJc w:val="left"/>
+      <w:pPr>
+        <w:tabs>
+          <w:tab w:val="num" w:pos="720"/>
+        </w:tabs>
+        <w:ind w:left="720" w:hanging="360"/>
+      </w:pPr>
+    </w:lvl>
+    <w:lvl w:ilvl="1" w:tentative="1">
+      <w:start w:val="1"/>
+      <w:numFmt w:val="decimal"/>
+      <w:lvlText w:val="%2."/>
+      <w:lvlJc w:val="left"/>
+      <w:pPr>
+        <w:tabs>
+          <w:tab w:val="num" w:pos="1440"/>
+        </w:tabs>
+        <w:ind w:left="1440" w:hanging="360"/>
+      </w:pPr>
+    </w:lvl>
+    <w:lvl w:ilvl="2" w:tentative="1">
+      <w:start w:val="1"/>
+      <w:numFmt w:val="decimal"/>
+      <w:lvlText w:val="%3."/>
+      <w:lvlJc w:val="left"/>
+      <w:pPr>
+        <w:tabs>
+          <w:tab w:val="num" w:pos="2160"/>
+        </w:tabs>
+        <w:ind w:left="2160" w:hanging="360"/>
+      </w:pPr>
+    </w:lvl>
+    <w:lvl w:ilvl="3" w:tentative="1">
+      <w:start w:val="1"/>
+      <w:numFmt w:val="decimal"/>
+      <w:lvlText w:val="%4."/>
+      <w:lvlJc w:val="left"/>
+      <w:pPr>
+        <w:tabs>
+          <w:tab w:val="num" w:pos="2880"/>
+        </w:tabs>
+        <w:ind w:left="2880" w:hanging="360"/>
+      </w:pPr>
+    </w:lvl>
+    <w:lvl w:ilvl="4" w:tentative="1">
+      <w:start w:val="1"/>
+      <w:numFmt w:val="decimal"/>
+      <w:lvlText w:val="%5."/>
+      <w:lvlJc w:val="left"/>
+      <w:pPr>
+        <w:tabs>
+          <w:tab w:val="num" w:pos="3600"/>
+        </w:tabs>
+        <w:ind w:left="3600" w:hanging="360"/>
+      </w:pPr>
+    </w:lvl>
+    <w:lvl w:ilvl="5" w:tentative="1">
+      <w:start w:val="1"/>
+      <w:numFmt w:val="decimal"/>
+      <w:lvlText w:val="%6."/>
+      <w:lvlJc w:val="left"/>
+      <w:pPr>
+        <w:tabs>
+          <w:tab w:val="num" w:pos="4320"/>
+        </w:tabs>
+        <w:ind w:left="4320" w:hanging="360"/>
+      </w:pPr>
+    </w:lvl>
+    <w:lvl w:ilvl="6" w:tentative="1">
+      <w:start w:val="1"/>
+      <w:numFmt w:val="decimal"/>
+      <w:lvlText w:val="%7."/>
+      <w:lvlJc w:val="left"/>
+      <w:pPr>
+        <w:tabs>
+          <w:tab w:val="num" w:pos="5040"/>
+        </w:tabs>
+        <w:ind w:left="5040" w:hanging="360"/>
+      </w:pPr>
+    </w:lvl>
+    <w:lvl w:ilvl="7" w:tentative="1">
+      <w:start w:val="1"/>
+      <w:numFmt w:val="decimal"/>
+      <w:lvlText w:val="%8."/>
+      <w:lvlJc w:val="left"/>
+      <w:pPr>
+        <w:tabs>
+          <w:tab w:val="num" w:pos="5760"/>
+        </w:tabs>
+        <w:ind w:left="5760" w:hanging="360"/>
+      </w:pPr>
+    </w:lvl>
+    <w:lvl w:ilvl="8" w:tentative="1">
+      <w:start w:val="1"/>
+      <w:numFmt w:val="decimal"/>
+      <w:lvlText w:val="%9."/>
+      <w:lvlJc w:val="left"/>
+      <w:pPr>
+        <w:tabs>
+          <w:tab w:val="num" w:pos="6480"/>
+        </w:tabs>
+        <w:ind w:left="6480" w:hanging="360"/>
+      </w:pPr>
+    </w:lvl>
+  </w:abstractNum>
+  <w:abstractNum w:abstractNumId="1" w15:restartNumberingAfterBreak="0">
+    <w:nsid w:val="236D57FD"/>
+    <w:multiLevelType w:val="multilevel"/>
+    <w:tmpl w:val="A9DA95EA"/>
+    <w:lvl w:ilvl="0">
+      <w:start w:val="1"/>
+      <w:numFmt w:val="decimal"/>
+      <w:lvlText w:val="%1."/>
+      <w:lvlJc w:val="left"/>
+      <w:pPr>
+        <w:tabs>
+          <w:tab w:val="num" w:pos="720"/>
+        </w:tabs>
+        <w:ind w:left="720" w:hanging="360"/>
+      </w:pPr>
+    </w:lvl>
+    <w:lvl w:ilvl="1" w:tentative="1">
+      <w:start w:val="1"/>
+      <w:numFmt w:val="decimal"/>
+      <w:lvlText w:val="%2."/>
+      <w:lvlJc w:val="left"/>
+      <w:pPr>
+        <w:tabs>
+          <w:tab w:val="num" w:pos="1440"/>
+        </w:tabs>
+        <w:ind w:left="1440" w:hanging="360"/>
+      </w:pPr>
+    </w:lvl>
+    <w:lvl w:ilvl="2" w:tentative="1">
+      <w:start w:val="1"/>
+      <w:numFmt w:val="decimal"/>
+      <w:lvlText w:val="%3."/>
+      <w:lvlJc w:val="left"/>
+      <w:pPr>
+        <w:tabs>
+          <w:tab w:val="num" w:pos="2160"/>
+        </w:tabs>
+        <w:ind w:left="2160" w:hanging="360"/>
+      </w:pPr>
+    </w:lvl>
+    <w:lvl w:ilvl="3" w:tentative="1">
+      <w:start w:val="1"/>
+      <w:numFmt w:val="decimal"/>
+      <w:lvlText w:val="%4."/>
+      <w:lvlJc w:val="left"/>
+      <w:pPr>
+        <w:tabs>
+          <w:tab w:val="num" w:pos="2880"/>
+        </w:tabs>
+        <w:ind w:left="2880" w:hanging="360"/>
+      </w:pPr>
+    </w:lvl>
+    <w:lvl w:ilvl="4" w:tentative="1">
+      <w:start w:val="1"/>
+      <w:numFmt w:val="decimal"/>
+      <w:lvlText w:val="%5."/>
+      <w:lvlJc w:val="left"/>
+      <w:pPr>
+        <w:tabs>
+          <w:tab w:val="num" w:pos="3600"/>
+        </w:tabs>
+        <w:ind w:left="3600" w:hanging="360"/>
+      </w:pPr>
+    </w:lvl>
+    <w:lvl w:ilvl="5" w:tentative="1">
+      <w:start w:val="1"/>
+      <w:numFmt w:val="decimal"/>
+      <w:lvlText w:val="%6."/>
+      <w:lvlJc w:val="left"/>
+      <w:pPr>
+        <w:tabs>
+          <w:tab w:val="num" w:pos="4320"/>
+        </w:tabs>
+        <w:ind w:left="4320" w:hanging="360"/>
+      </w:pPr>
+    </w:lvl>
+    <w:lvl w:ilvl="6" w:tentative="1">
+      <w:start w:val="1"/>
+      <w:numFmt w:val="decimal"/>
+      <w:lvlText w:val="%7."/>
+      <w:lvlJc w:val="left"/>
+      <w:pPr>
+        <w:tabs>
+          <w:tab w:val="num" w:pos="5040"/>
+        </w:tabs>
+        <w:ind w:left="5040" w:hanging="360"/>
+      </w:pPr>
+    </w:lvl>
+    <w:lvl w:ilvl="7" w:tentative="1">
+      <w:start w:val="1"/>
+      <w:numFmt w:val="decimal"/>
+      <w:lvlText w:val="%8."/>
+      <w:lvlJc w:val="left"/>
+      <w:pPr>
+        <w:tabs>
+          <w:tab w:val="num" w:pos="5760"/>
+        </w:tabs>
+        <w:ind w:left="5760" w:hanging="360"/>
+      </w:pPr>
+    </w:lvl>
+    <w:lvl w:ilvl="8" w:tentative="1">
+      <w:start w:val="1"/>
+      <w:numFmt w:val="decimal"/>
+      <w:lvlText w:val="%9."/>
+      <w:lvlJc w:val="left"/>
+      <w:pPr>
+        <w:tabs>
+          <w:tab w:val="num" w:pos="6480"/>
+        </w:tabs>
+        <w:ind w:left="6480" w:hanging="360"/>
+      </w:pPr>
+    </w:lvl>
+  </w:abstractNum>
+  <w:abstractNum w:abstractNumId="2" w15:restartNumberingAfterBreak="0">
+    <w:nsid w:val="2D3B797C"/>
+    <w:multiLevelType w:val="multilevel"/>
+    <w:tmpl w:val="DCE6E5BC"/>
+    <w:lvl w:ilvl="0">
+      <w:start w:val="1"/>
+      <w:numFmt w:val="decimal"/>
+      <w:lvlText w:val="%1."/>
+      <w:lvlJc w:val="left"/>
+      <w:pPr>
+        <w:tabs>
+          <w:tab w:val="num" w:pos="720"/>
+        </w:tabs>
+        <w:ind w:left="720" w:hanging="360"/>
+      </w:pPr>
+    </w:lvl>
+    <w:lvl w:ilvl="1" w:tentative="1">
+      <w:start w:val="1"/>
+      <w:numFmt w:val="decimal"/>
+      <w:lvlText w:val="%2."/>
+      <w:lvlJc w:val="left"/>
+      <w:pPr>
+        <w:tabs>
+          <w:tab w:val="num" w:pos="1440"/>
+        </w:tabs>
+        <w:ind w:left="1440" w:hanging="360"/>
+      </w:pPr>
+    </w:lvl>
+    <w:lvl w:ilvl="2" w:tentative="1">
+      <w:start w:val="1"/>
+      <w:numFmt w:val="decimal"/>
+      <w:lvlText w:val="%3."/>
+      <w:lvlJc w:val="left"/>
+      <w:pPr>
+        <w:tabs>
+          <w:tab w:val="num" w:pos="2160"/>
+        </w:tabs>
+        <w:ind w:left="2160" w:hanging="360"/>
+      </w:pPr>
+    </w:lvl>
+    <w:lvl w:ilvl="3" w:tentative="1">
+      <w:start w:val="1"/>
+      <w:numFmt w:val="decimal"/>
+      <w:lvlText w:val="%4."/>
+      <w:lvlJc w:val="left"/>
+      <w:pPr>
+        <w:tabs>
+          <w:tab w:val="num" w:pos="2880"/>
+        </w:tabs>
+        <w:ind w:left="2880" w:hanging="360"/>
+      </w:pPr>
+    </w:lvl>
+    <w:lvl w:ilvl="4" w:tentative="1">
+      <w:start w:val="1"/>
+      <w:numFmt w:val="decimal"/>
+      <w:lvlText w:val="%5."/>
+      <w:lvlJc w:val="left"/>
+      <w:pPr>
+        <w:tabs>
+          <w:tab w:val="num" w:pos="3600"/>
+        </w:tabs>
+        <w:ind w:left="3600" w:hanging="360"/>
+      </w:pPr>
+    </w:lvl>
+    <w:lvl w:ilvl="5" w:tentative="1">
+      <w:start w:val="1"/>
+      <w:numFmt w:val="decimal"/>
+      <w:lvlText w:val="%6."/>
+      <w:lvlJc w:val="left"/>
+      <w:pPr>
+        <w:tabs>
+          <w:tab w:val="num" w:pos="4320"/>
+        </w:tabs>
+        <w:ind w:left="4320" w:hanging="360"/>
+      </w:pPr>
+    </w:lvl>
+    <w:lvl w:ilvl="6" w:tentative="1">
+      <w:start w:val="1"/>
+      <w:numFmt w:val="decimal"/>
+      <w:lvlText w:val="%7."/>
+      <w:lvlJc w:val="left"/>
+      <w:pPr>
+        <w:tabs>
+          <w:tab w:val="num" w:pos="5040"/>
+        </w:tabs>
+        <w:ind w:left="5040" w:hanging="360"/>
+      </w:pPr>
+    </w:lvl>
+    <w:lvl w:ilvl="7" w:tentative="1">
+      <w:start w:val="1"/>
+      <w:numFmt w:val="decimal"/>
+      <w:lvlText w:val="%8."/>
+      <w:lvlJc w:val="left"/>
+      <w:pPr>
+        <w:tabs>
+          <w:tab w:val="num" w:pos="5760"/>
+        </w:tabs>
+        <w:ind w:left="5760" w:hanging="360"/>
+      </w:pPr>
+    </w:lvl>
+    <w:lvl w:ilvl="8" w:tentative="1">
+      <w:start w:val="1"/>
+      <w:numFmt w:val="decimal"/>
+      <w:lvlText w:val="%9."/>
+      <w:lvlJc w:val="left"/>
+      <w:pPr>
+        <w:tabs>
+          <w:tab w:val="num" w:pos="6480"/>
+        </w:tabs>
+        <w:ind w:left="6480" w:hanging="360"/>
+      </w:pPr>
+    </w:lvl>
+  </w:abstractNum>
+  <w:abstractNum w:abstractNumId="3" w15:restartNumberingAfterBreak="0">
+    <w:nsid w:val="4A8B036B"/>
+    <w:multiLevelType w:val="multilevel"/>
+    <w:tmpl w:val="A9326D48"/>
+    <w:lvl w:ilvl="0">
+      <w:start w:val="1"/>
+      <w:numFmt w:val="decimal"/>
+      <w:lvlText w:val="%1."/>
+      <w:lvlJc w:val="left"/>
+      <w:pPr>
+        <w:tabs>
+          <w:tab w:val="num" w:pos="720"/>
+        </w:tabs>
+        <w:ind w:left="720" w:hanging="360"/>
+      </w:pPr>
+    </w:lvl>
+    <w:lvl w:ilvl="1" w:tentative="1">
+      <w:start w:val="1"/>
+      <w:numFmt w:val="decimal"/>
+      <w:lvlText w:val="%2."/>
+      <w:lvlJc w:val="left"/>
+      <w:pPr>
+        <w:tabs>
+          <w:tab w:val="num" w:pos="1440"/>
+        </w:tabs>
+        <w:ind w:left="1440" w:hanging="360"/>
+      </w:pPr>
+    </w:lvl>
+    <w:lvl w:ilvl="2" w:tentative="1">
+      <w:start w:val="1"/>
+      <w:numFmt w:val="decimal"/>
+      <w:lvlText w:val="%3."/>
+      <w:lvlJc w:val="left"/>
+      <w:pPr>
+        <w:tabs>
+          <w:tab w:val="num" w:pos="2160"/>
+        </w:tabs>
+        <w:ind w:left="2160" w:hanging="360"/>
+      </w:pPr>
+    </w:lvl>
+    <w:lvl w:ilvl="3" w:tentative="1">
+      <w:start w:val="1"/>
+      <w:numFmt w:val="decimal"/>
+      <w:lvlText w:val="%4."/>
+      <w:lvlJc w:val="left"/>
+      <w:pPr>
+        <w:tabs>
+          <w:tab w:val="num" w:pos="2880"/>
+        </w:tabs>
+        <w:ind w:left="2880" w:hanging="360"/>
+      </w:pPr>
+    </w:lvl>
+    <w:lvl w:ilvl="4" w:tentative="1">
+      <w:start w:val="1"/>
+      <w:numFmt w:val="decimal"/>
+      <w:lvlText w:val="%5."/>
+      <w:lvlJc w:val="left"/>
+      <w:pPr>
+        <w:tabs>
+          <w:tab w:val="num" w:pos="3600"/>
+        </w:tabs>
+        <w:ind w:left="3600" w:hanging="360"/>
+      </w:pPr>
+    </w:lvl>
+    <w:lvl w:ilvl="5" w:tentative="1">
+      <w:start w:val="1"/>
+      <w:numFmt w:val="decimal"/>
+      <w:lvlText w:val="%6."/>
+      <w:lvlJc w:val="left"/>
+      <w:pPr>
+        <w:tabs>
+          <w:tab w:val="num" w:pos="4320"/>
+        </w:tabs>
+        <w:ind w:left="4320" w:hanging="360"/>
+      </w:pPr>
+    </w:lvl>
+    <w:lvl w:ilvl="6" w:tentative="1">
+      <w:start w:val="1"/>
+      <w:numFmt w:val="decimal"/>
+      <w:lvlText w:val="%7."/>
+      <w:lvlJc w:val="left"/>
+      <w:pPr>
+        <w:tabs>
+          <w:tab w:val="num" w:pos="5040"/>
+        </w:tabs>
+        <w:ind w:left="5040" w:hanging="360"/>
+      </w:pPr>
+    </w:lvl>
+    <w:lvl w:ilvl="7" w:tentative="1">
+      <w:start w:val="1"/>
+      <w:numFmt w:val="decimal"/>
+      <w:lvlText w:val="%8."/>
+      <w:lvlJc w:val="left"/>
+      <w:pPr>
+        <w:tabs>
+          <w:tab w:val="num" w:pos="5760"/>
+        </w:tabs>
+        <w:ind w:left="5760" w:hanging="360"/>
+      </w:pPr>
+    </w:lvl>
+    <w:lvl w:ilvl="8" w:tentative="1">
+      <w:start w:val="1"/>
+      <w:numFmt w:val="decimal"/>
+      <w:lvlText w:val="%9."/>
+      <w:lvlJc w:val="left"/>
+      <w:pPr>
+        <w:tabs>
+          <w:tab w:val="num" w:pos="6480"/>
+        </w:tabs>
+        <w:ind w:left="6480" w:hanging="360"/>
+      </w:pPr>
+    </w:lvl>
+  </w:abstractNum>
+  <w:abstractNum w:abstractNumId="4" w15:restartNumberingAfterBreak="0">
+    <w:nsid w:val="4DFE60D5"/>
+    <w:multiLevelType w:val="multilevel"/>
+    <w:tmpl w:val="4BF2E602"/>
+    <w:lvl w:ilvl="0">
+      <w:start w:val="1"/>
+      <w:numFmt w:val="decimal"/>
+      <w:lvlText w:val="%1."/>
+      <w:lvlJc w:val="left"/>
+      <w:pPr>
+        <w:tabs>
+          <w:tab w:val="num" w:pos="720"/>
+        </w:tabs>
+        <w:ind w:left="720" w:hanging="360"/>
+      </w:pPr>
+    </w:lvl>
+    <w:lvl w:ilvl="1" w:tentative="1">
+      <w:start w:val="1"/>
+      <w:numFmt w:val="decimal"/>
+      <w:lvlText w:val="%2."/>
+      <w:lvlJc w:val="left"/>
+      <w:pPr>
+        <w:tabs>
+          <w:tab w:val="num" w:pos="1440"/>
+        </w:tabs>
+        <w:ind w:left="1440" w:hanging="360"/>
+      </w:pPr>
+    </w:lvl>
+    <w:lvl w:ilvl="2" w:tentative="1">
+      <w:start w:val="1"/>
+      <w:numFmt w:val="decimal"/>
+      <w:lvlText w:val="%3."/>
+      <w:lvlJc w:val="left"/>
+      <w:pPr>
+        <w:tabs>
+          <w:tab w:val="num" w:pos="2160"/>
+        </w:tabs>
+        <w:ind w:left="2160" w:hanging="360"/>
+      </w:pPr>
+    </w:lvl>
+    <w:lvl w:ilvl="3" w:tentative="1">
+      <w:start w:val="1"/>
+      <w:numFmt w:val="decimal"/>
+      <w:lvlText w:val="%4."/>
+      <w:lvlJc w:val="left"/>
+      <w:pPr>
+        <w:tabs>
+          <w:tab w:val="num" w:pos="2880"/>
+        </w:tabs>
+        <w:ind w:left="2880" w:hanging="360"/>
+      </w:pPr>
+    </w:lvl>
+    <w:lvl w:ilvl="4" w:tentative="1">
+      <w:start w:val="1"/>
+      <w:numFmt w:val="decimal"/>
+      <w:lvlText w:val="%5."/>
+      <w:lvlJc w:val="left"/>
+      <w:pPr>
+        <w:tabs>
+          <w:tab w:val="num" w:pos="3600"/>
+        </w:tabs>
+        <w:ind w:left="3600" w:hanging="360"/>
+      </w:pPr>
+    </w:lvl>
+    <w:lvl w:ilvl="5" w:tentative="1">
+      <w:start w:val="1"/>
+      <w:numFmt w:val="decimal"/>
+      <w:lvlText w:val="%6."/>
+      <w:lvlJc w:val="left"/>
+      <w:pPr>
+        <w:tabs>
+          <w:tab w:val="num" w:pos="4320"/>
+        </w:tabs>
+        <w:ind w:left="4320" w:hanging="360"/>
+      </w:pPr>
+    </w:lvl>
+    <w:lvl w:ilvl="6" w:tentative="1">
+      <w:start w:val="1"/>
+      <w:numFmt w:val="decimal"/>
+      <w:lvlText w:val="%7."/>
+      <w:lvlJc w:val="left"/>
+      <w:pPr>
+        <w:tabs>
+          <w:tab w:val="num" w:pos="5040"/>
+        </w:tabs>
+        <w:ind w:left="5040" w:hanging="360"/>
+      </w:pPr>
+    </w:lvl>
+    <w:lvl w:ilvl="7" w:tentative="1">
+      <w:start w:val="1"/>
+      <w:numFmt w:val="decimal"/>
+      <w:lvlText w:val="%8."/>
+      <w:lvlJc w:val="left"/>
+      <w:pPr>
+        <w:tabs>
+          <w:tab w:val="num" w:pos="5760"/>
+        </w:tabs>
+        <w:ind w:left="5760" w:hanging="360"/>
+      </w:pPr>
+    </w:lvl>
+    <w:lvl w:ilvl="8" w:tentative="1">
+      <w:start w:val="1"/>
+      <w:numFmt w:val="decimal"/>
+      <w:lvlText w:val="%9."/>
+      <w:lvlJc w:val="left"/>
+      <w:pPr>
+        <w:tabs>
+          <w:tab w:val="num" w:pos="6480"/>
+        </w:tabs>
+        <w:ind w:left="6480" w:hanging="360"/>
+      </w:pPr>
+    </w:lvl>
+  </w:abstractNum>
+  <w:abstractNum w:abstractNumId="5" w15:restartNumberingAfterBreak="0">
+    <w:nsid w:val="66AE61F6"/>
+    <w:multiLevelType w:val="multilevel"/>
+    <w:tmpl w:val="F1B2D91C"/>
+    <w:lvl w:ilvl="0">
+      <w:start w:val="1"/>
+      <w:numFmt w:val="decimal"/>
+      <w:lvlText w:val="%1."/>
+      <w:lvlJc w:val="left"/>
+      <w:pPr>
+        <w:tabs>
+          <w:tab w:val="num" w:pos="720"/>
+        </w:tabs>
+        <w:ind w:left="720" w:hanging="360"/>
+      </w:pPr>
+    </w:lvl>
+    <w:lvl w:ilvl="1" w:tentative="1">
+      <w:start w:val="1"/>
+      <w:numFmt w:val="decimal"/>
+      <w:lvlText w:val="%2."/>
+      <w:lvlJc w:val="left"/>
+      <w:pPr>
+        <w:tabs>
+          <w:tab w:val="num" w:pos="1440"/>
+        </w:tabs>
+        <w:ind w:left="1440" w:hanging="360"/>
+      </w:pPr>
+    </w:lvl>
+    <w:lvl w:ilvl="2" w:tentative="1">
+      <w:start w:val="1"/>
+      <w:numFmt w:val="decimal"/>
+      <w:lvlText w:val="%3."/>
+      <w:lvlJc w:val="left"/>
+      <w:pPr>
+        <w:tabs>
+          <w:tab w:val="num" w:pos="2160"/>
+        </w:tabs>
+        <w:ind w:left="2160" w:hanging="360"/>
+      </w:pPr>
+    </w:lvl>
+    <w:lvl w:ilvl="3" w:tentative="1">
+      <w:start w:val="1"/>
+      <w:numFmt w:val="decimal"/>
+      <w:lvlText w:val="%4."/>
+      <w:lvlJc w:val="left"/>
+      <w:pPr>
+        <w:tabs>
+          <w:tab w:val="num" w:pos="2880"/>
+        </w:tabs>
+        <w:ind w:left="2880" w:hanging="360"/>
+      </w:pPr>
+    </w:lvl>
+    <w:lvl w:ilvl="4" w:tentative="1">
+      <w:start w:val="1"/>
+      <w:numFmt w:val="decimal"/>
+      <w:lvlText w:val="%5."/>
+      <w:lvlJc w:val="left"/>
+      <w:pPr>
+        <w:tabs>
+          <w:tab w:val="num" w:pos="3600"/>
+        </w:tabs>
+        <w:ind w:left="3600" w:hanging="360"/>
+      </w:pPr>
+    </w:lvl>
+    <w:lvl w:ilvl="5" w:tentative="1">
+      <w:start w:val="1"/>
+      <w:numFmt w:val="decimal"/>
+      <w:lvlText w:val="%6."/>
+      <w:lvlJc w:val="left"/>
+      <w:pPr>
+        <w:tabs>
+          <w:tab w:val="num" w:pos="4320"/>
+        </w:tabs>
+        <w:ind w:left="4320" w:hanging="360"/>
+      </w:pPr>
+    </w:lvl>
+    <w:lvl w:ilvl="6" w:tentative="1">
+      <w:start w:val="1"/>
+      <w:numFmt w:val="decimal"/>
+      <w:lvlText w:val="%7."/>
+      <w:lvlJc w:val="left"/>
+      <w:pPr>
+        <w:tabs>
+          <w:tab w:val="num" w:pos="5040"/>
+        </w:tabs>
+        <w:ind w:left="5040" w:hanging="360"/>
+      </w:pPr>
+    </w:lvl>
+    <w:lvl w:ilvl="7" w:tentative="1">
+      <w:start w:val="1"/>
+      <w:numFmt w:val="decimal"/>
+      <w:lvlText w:val="%8."/>
+      <w:lvlJc w:val="left"/>
+      <w:pPr>
+        <w:tabs>
+          <w:tab w:val="num" w:pos="5760"/>
+        </w:tabs>
+        <w:ind w:left="5760" w:hanging="360"/>
+      </w:pPr>
+    </w:lvl>
+    <w:lvl w:ilvl="8" w:tentative="1">
+      <w:start w:val="1"/>
+      <w:numFmt w:val="decimal"/>
+      <w:lvlText w:val="%9."/>
+      <w:lvlJc w:val="left"/>
+      <w:pPr>
+        <w:tabs>
+          <w:tab w:val="num" w:pos="6480"/>
+        </w:tabs>
+        <w:ind w:left="6480" w:hanging="360"/>
+      </w:pPr>
+    </w:lvl>
+  </w:abstractNum>
+  <w:abstractNum w:abstractNumId="6" w15:restartNumberingAfterBreak="0">
     <w:nsid w:val="6AC25EBA"/>
     <w:multiLevelType w:val="multilevel"/>
     <w:tmpl w:val="93C2ED58"/>
@@ -531,8 +2029,258 @@
       </w:pPr>
     </w:lvl>
   </w:abstractNum>
+  <w:abstractNum w:abstractNumId="7" w15:restartNumberingAfterBreak="0">
+    <w:nsid w:val="719A6C0D"/>
+    <w:multiLevelType w:val="multilevel"/>
+    <w:tmpl w:val="D5FE0170"/>
+    <w:lvl w:ilvl="0">
+      <w:start w:val="1"/>
+      <w:numFmt w:val="decimal"/>
+      <w:lvlText w:val="%1."/>
+      <w:lvlJc w:val="left"/>
+      <w:pPr>
+        <w:tabs>
+          <w:tab w:val="num" w:pos="720"/>
+        </w:tabs>
+        <w:ind w:left="720" w:hanging="360"/>
+      </w:pPr>
+    </w:lvl>
+    <w:lvl w:ilvl="1" w:tentative="1">
+      <w:start w:val="1"/>
+      <w:numFmt w:val="decimal"/>
+      <w:lvlText w:val="%2."/>
+      <w:lvlJc w:val="left"/>
+      <w:pPr>
+        <w:tabs>
+          <w:tab w:val="num" w:pos="1440"/>
+        </w:tabs>
+        <w:ind w:left="1440" w:hanging="360"/>
+      </w:pPr>
+    </w:lvl>
+    <w:lvl w:ilvl="2" w:tentative="1">
+      <w:start w:val="1"/>
+      <w:numFmt w:val="decimal"/>
+      <w:lvlText w:val="%3."/>
+      <w:lvlJc w:val="left"/>
+      <w:pPr>
+        <w:tabs>
+          <w:tab w:val="num" w:pos="2160"/>
+        </w:tabs>
+        <w:ind w:left="2160" w:hanging="360"/>
+      </w:pPr>
+    </w:lvl>
+    <w:lvl w:ilvl="3" w:tentative="1">
+      <w:start w:val="1"/>
+      <w:numFmt w:val="decimal"/>
+      <w:lvlText w:val="%4."/>
+      <w:lvlJc w:val="left"/>
+      <w:pPr>
+        <w:tabs>
+          <w:tab w:val="num" w:pos="2880"/>
+        </w:tabs>
+        <w:ind w:left="2880" w:hanging="360"/>
+      </w:pPr>
+    </w:lvl>
+    <w:lvl w:ilvl="4" w:tentative="1">
+      <w:start w:val="1"/>
+      <w:numFmt w:val="decimal"/>
+      <w:lvlText w:val="%5."/>
+      <w:lvlJc w:val="left"/>
+      <w:pPr>
+        <w:tabs>
+          <w:tab w:val="num" w:pos="3600"/>
+        </w:tabs>
+        <w:ind w:left="3600" w:hanging="360"/>
+      </w:pPr>
+    </w:lvl>
+    <w:lvl w:ilvl="5" w:tentative="1">
+      <w:start w:val="1"/>
+      <w:numFmt w:val="decimal"/>
+      <w:lvlText w:val="%6."/>
+      <w:lvlJc w:val="left"/>
+      <w:pPr>
+        <w:tabs>
+          <w:tab w:val="num" w:pos="4320"/>
+        </w:tabs>
+        <w:ind w:left="4320" w:hanging="360"/>
+      </w:pPr>
+    </w:lvl>
+    <w:lvl w:ilvl="6" w:tentative="1">
+      <w:start w:val="1"/>
+      <w:numFmt w:val="decimal"/>
+      <w:lvlText w:val="%7."/>
+      <w:lvlJc w:val="left"/>
+      <w:pPr>
+        <w:tabs>
+          <w:tab w:val="num" w:pos="5040"/>
+        </w:tabs>
+        <w:ind w:left="5040" w:hanging="360"/>
+      </w:pPr>
+    </w:lvl>
+    <w:lvl w:ilvl="7" w:tentative="1">
+      <w:start w:val="1"/>
+      <w:numFmt w:val="decimal"/>
+      <w:lvlText w:val="%8."/>
+      <w:lvlJc w:val="left"/>
+      <w:pPr>
+        <w:tabs>
+          <w:tab w:val="num" w:pos="5760"/>
+        </w:tabs>
+        <w:ind w:left="5760" w:hanging="360"/>
+      </w:pPr>
+    </w:lvl>
+    <w:lvl w:ilvl="8" w:tentative="1">
+      <w:start w:val="1"/>
+      <w:numFmt w:val="decimal"/>
+      <w:lvlText w:val="%9."/>
+      <w:lvlJc w:val="left"/>
+      <w:pPr>
+        <w:tabs>
+          <w:tab w:val="num" w:pos="6480"/>
+        </w:tabs>
+        <w:ind w:left="6480" w:hanging="360"/>
+      </w:pPr>
+    </w:lvl>
+  </w:abstractNum>
+  <w:abstractNum w:abstractNumId="8" w15:restartNumberingAfterBreak="0">
+    <w:nsid w:val="77FE2BAF"/>
+    <w:multiLevelType w:val="multilevel"/>
+    <w:tmpl w:val="019633C8"/>
+    <w:lvl w:ilvl="0">
+      <w:start w:val="1"/>
+      <w:numFmt w:val="decimal"/>
+      <w:lvlText w:val="%1."/>
+      <w:lvlJc w:val="left"/>
+      <w:pPr>
+        <w:tabs>
+          <w:tab w:val="num" w:pos="720"/>
+        </w:tabs>
+        <w:ind w:left="720" w:hanging="360"/>
+      </w:pPr>
+    </w:lvl>
+    <w:lvl w:ilvl="1" w:tentative="1">
+      <w:start w:val="1"/>
+      <w:numFmt w:val="decimal"/>
+      <w:lvlText w:val="%2."/>
+      <w:lvlJc w:val="left"/>
+      <w:pPr>
+        <w:tabs>
+          <w:tab w:val="num" w:pos="1440"/>
+        </w:tabs>
+        <w:ind w:left="1440" w:hanging="360"/>
+      </w:pPr>
+    </w:lvl>
+    <w:lvl w:ilvl="2" w:tentative="1">
+      <w:start w:val="1"/>
+      <w:numFmt w:val="decimal"/>
+      <w:lvlText w:val="%3."/>
+      <w:lvlJc w:val="left"/>
+      <w:pPr>
+        <w:tabs>
+          <w:tab w:val="num" w:pos="2160"/>
+        </w:tabs>
+        <w:ind w:left="2160" w:hanging="360"/>
+      </w:pPr>
+    </w:lvl>
+    <w:lvl w:ilvl="3" w:tentative="1">
+      <w:start w:val="1"/>
+      <w:numFmt w:val="decimal"/>
+      <w:lvlText w:val="%4."/>
+      <w:lvlJc w:val="left"/>
+      <w:pPr>
+        <w:tabs>
+          <w:tab w:val="num" w:pos="2880"/>
+        </w:tabs>
+        <w:ind w:left="2880" w:hanging="360"/>
+      </w:pPr>
+    </w:lvl>
+    <w:lvl w:ilvl="4" w:tentative="1">
+      <w:start w:val="1"/>
+      <w:numFmt w:val="decimal"/>
+      <w:lvlText w:val="%5."/>
+      <w:lvlJc w:val="left"/>
+      <w:pPr>
+        <w:tabs>
+          <w:tab w:val="num" w:pos="3600"/>
+        </w:tabs>
+        <w:ind w:left="3600" w:hanging="360"/>
+      </w:pPr>
+    </w:lvl>
+    <w:lvl w:ilvl="5" w:tentative="1">
+      <w:start w:val="1"/>
+      <w:numFmt w:val="decimal"/>
+      <w:lvlText w:val="%6."/>
+      <w:lvlJc w:val="left"/>
+      <w:pPr>
+        <w:tabs>
+          <w:tab w:val="num" w:pos="4320"/>
+        </w:tabs>
+        <w:ind w:left="4320" w:hanging="360"/>
+      </w:pPr>
+    </w:lvl>
+    <w:lvl w:ilvl="6" w:tentative="1">
+      <w:start w:val="1"/>
+      <w:numFmt w:val="decimal"/>
+      <w:lvlText w:val="%7."/>
+      <w:lvlJc w:val="left"/>
+      <w:pPr>
+        <w:tabs>
+          <w:tab w:val="num" w:pos="5040"/>
+        </w:tabs>
+        <w:ind w:left="5040" w:hanging="360"/>
+      </w:pPr>
+    </w:lvl>
+    <w:lvl w:ilvl="7" w:tentative="1">
+      <w:start w:val="1"/>
+      <w:numFmt w:val="decimal"/>
+      <w:lvlText w:val="%8."/>
+      <w:lvlJc w:val="left"/>
+      <w:pPr>
+        <w:tabs>
+          <w:tab w:val="num" w:pos="5760"/>
+        </w:tabs>
+        <w:ind w:left="5760" w:hanging="360"/>
+      </w:pPr>
+    </w:lvl>
+    <w:lvl w:ilvl="8" w:tentative="1">
+      <w:start w:val="1"/>
+      <w:numFmt w:val="decimal"/>
+      <w:lvlText w:val="%9."/>
+      <w:lvlJc w:val="left"/>
+      <w:pPr>
+        <w:tabs>
+          <w:tab w:val="num" w:pos="6480"/>
+        </w:tabs>
+        <w:ind w:left="6480" w:hanging="360"/>
+      </w:pPr>
+    </w:lvl>
+  </w:abstractNum>
   <w:num w:numId="1">
+    <w:abstractNumId w:val="6"/>
+  </w:num>
+  <w:num w:numId="2">
+    <w:abstractNumId w:val="1"/>
+  </w:num>
+  <w:num w:numId="3">
+    <w:abstractNumId w:val="4"/>
+  </w:num>
+  <w:num w:numId="4">
+    <w:abstractNumId w:val="2"/>
+  </w:num>
+  <w:num w:numId="5">
+    <w:abstractNumId w:val="7"/>
+  </w:num>
+  <w:num w:numId="6">
+    <w:abstractNumId w:val="3"/>
+  </w:num>
+  <w:num w:numId="7">
+    <w:abstractNumId w:val="8"/>
+  </w:num>
+  <w:num w:numId="8">
     <w:abstractNumId w:val="0"/>
+  </w:num>
+  <w:num w:numId="9">
+    <w:abstractNumId w:val="5"/>
   </w:num>
 </w:numbering>
 </file>
@@ -937,6 +2685,50 @@
       <w:jc w:val="both"/>
     </w:pPr>
   </w:style>
+  <w:style w:type="paragraph" w:styleId="2">
+    <w:name w:val="heading 2"/>
+    <w:basedOn w:val="a"/>
+    <w:link w:val="20"/>
+    <w:uiPriority w:val="9"/>
+    <w:qFormat/>
+    <w:rsid w:val="00FB6CC3"/>
+    <w:pPr>
+      <w:widowControl/>
+      <w:spacing w:before="100" w:beforeAutospacing="1" w:after="100" w:afterAutospacing="1"/>
+      <w:jc w:val="left"/>
+      <w:outlineLvl w:val="1"/>
+    </w:pPr>
+    <w:rPr>
+      <w:rFonts w:ascii="宋体" w:eastAsia="宋体" w:hAnsi="宋体" w:cs="宋体"/>
+      <w:b/>
+      <w:bCs/>
+      <w:kern w:val="0"/>
+      <w:sz w:val="36"/>
+      <w:szCs w:val="36"/>
+    </w:rPr>
+  </w:style>
+  <w:style w:type="paragraph" w:styleId="3">
+    <w:name w:val="heading 3"/>
+    <w:basedOn w:val="a"/>
+    <w:link w:val="30"/>
+    <w:uiPriority w:val="9"/>
+    <w:qFormat/>
+    <w:rsid w:val="00FB6CC3"/>
+    <w:pPr>
+      <w:widowControl/>
+      <w:spacing w:before="100" w:beforeAutospacing="1" w:after="100" w:afterAutospacing="1"/>
+      <w:jc w:val="left"/>
+      <w:outlineLvl w:val="2"/>
+    </w:pPr>
+    <w:rPr>
+      <w:rFonts w:ascii="宋体" w:eastAsia="宋体" w:hAnsi="宋体" w:cs="宋体"/>
+      <w:b/>
+      <w:bCs/>
+      <w:kern w:val="0"/>
+      <w:sz w:val="27"/>
+      <w:szCs w:val="27"/>
+    </w:rPr>
+  </w:style>
   <w:style w:type="character" w:default="1" w:styleId="a0">
     <w:name w:val="Default Paragraph Font"/>
     <w:uiPriority w:val="1"/>
@@ -980,6 +2772,36 @@
       <w:kern w:val="0"/>
       <w:sz w:val="24"/>
       <w:szCs w:val="24"/>
+    </w:rPr>
+  </w:style>
+  <w:style w:type="character" w:customStyle="1" w:styleId="20">
+    <w:name w:val="标题 2 字符"/>
+    <w:basedOn w:val="a0"/>
+    <w:link w:val="2"/>
+    <w:uiPriority w:val="9"/>
+    <w:rsid w:val="00FB6CC3"/>
+    <w:rPr>
+      <w:rFonts w:ascii="宋体" w:eastAsia="宋体" w:hAnsi="宋体" w:cs="宋体"/>
+      <w:b/>
+      <w:bCs/>
+      <w:kern w:val="0"/>
+      <w:sz w:val="36"/>
+      <w:szCs w:val="36"/>
+    </w:rPr>
+  </w:style>
+  <w:style w:type="character" w:customStyle="1" w:styleId="30">
+    <w:name w:val="标题 3 字符"/>
+    <w:basedOn w:val="a0"/>
+    <w:link w:val="3"/>
+    <w:uiPriority w:val="9"/>
+    <w:rsid w:val="00FB6CC3"/>
+    <w:rPr>
+      <w:rFonts w:ascii="宋体" w:eastAsia="宋体" w:hAnsi="宋体" w:cs="宋体"/>
+      <w:b/>
+      <w:bCs/>
+      <w:kern w:val="0"/>
+      <w:sz w:val="27"/>
+      <w:szCs w:val="27"/>
     </w:rPr>
   </w:style>
 </w:styles>

</xml_diff>

<commit_message>
vault backup: 2026-06-17 11:04:23
</commit_message>
<xml_diff>
--- a/essay.docx
+++ b/essay.docx
@@ -47,7 +47,25 @@
           <w:sz w:val="24"/>
           <w:szCs w:val="24"/>
         </w:rPr>
-        <w:t>发展，淘宝、闲鱼、抖音等平台已成为活体宠物交易的重要渠道。在市场规模持续扩大的同时，大量消费者反映收到“星期宠”、宠物运输途中死亡、商家无法提供检疫证明等恶劣情况。这种脱离常规监管的活体寄递行为，不仅存在于伴侣动物市场，更向野生动物领域蔓延，呈现出明显的普遍化与产业化特征。</w:t>
+        <w:t>发展，淘宝、</w:t>
+      </w:r>
+      <w:r>
+        <w:rPr>
+          <w:rFonts w:ascii="宋体" w:eastAsia="宋体" w:hAnsi="宋体" w:cs="宋体" w:hint="eastAsia"/>
+          <w:kern w:val="0"/>
+          <w:sz w:val="24"/>
+          <w:szCs w:val="24"/>
+        </w:rPr>
+        <w:t>闲鱼</w:t>
+      </w:r>
+      <w:r>
+        <w:rPr>
+          <w:rFonts w:ascii="宋体" w:eastAsia="宋体" w:hAnsi="宋体" w:cs="宋体"/>
+          <w:kern w:val="0"/>
+          <w:sz w:val="24"/>
+          <w:szCs w:val="24"/>
+        </w:rPr>
+        <w:t>等平台已成为活体宠物交易的重要渠道。在市场规模持续扩大的同时，大量消费者反映收到“星期宠”、宠物运输途中死亡、商家无法提供检疫证明等情况。这种脱离常规监管的活体寄递行为，不仅存在于伴侣动物市场，更向野生动物领域蔓延，呈现出普遍化与产业化特征。</w:t>
       </w:r>
     </w:p>
     <w:p>
@@ -69,7 +87,61 @@
           <w:sz w:val="24"/>
           <w:szCs w:val="24"/>
         </w:rPr>
-        <w:t>国内媒体对全国重要宠物繁育基地江苏徐州的专项调查揭示，每日有数百件活体猫狗通过普通快递网络流向全国。托运中介公然宣称“无需检疫证明”，致使活体动物与普通货物混装运输，频繁发生致死事件。此外，2026年6月，辽宁省葫芦岛市公安机关破获一起案件，嫌疑人利用曾经作为快递员的便利，假借普通货物名义违规邮寄228只国家“三有”保护鸟类。这两个案例相互印证，暴露了活体动物网络交易背后一条成熟的、刻意规避监管的“地下”流通网络。</w:t>
+        <w:t>国内媒体对全国重要宠物繁育基地江苏徐州的专项调查揭示，每日有数百件活体猫狗通过普通快递网络流向全国。托运中介公然宣称“无需检疫证明”，致使活体动物与普通货物混装运输，频繁发生致死事件。此外，2026年6月，辽宁省葫芦岛市公安机关破获一起案件，嫌疑人利用曾经作为快递员的便利，假借普通货物名义违规邮寄228只国家“三有”保护鸟类。</w:t>
+      </w:r>
+      <w:r>
+        <w:rPr>
+          <w:rFonts w:ascii="宋体" w:eastAsia="宋体" w:hAnsi="宋体" w:cs="宋体" w:hint="eastAsia"/>
+          <w:kern w:val="0"/>
+          <w:sz w:val="24"/>
+          <w:szCs w:val="24"/>
+        </w:rPr>
+        <w:t>这两个事件</w:t>
+      </w:r>
+      <w:r>
+        <w:rPr>
+          <w:rFonts w:ascii="宋体" w:eastAsia="宋体" w:hAnsi="宋体" w:cs="宋体"/>
+          <w:kern w:val="0"/>
+          <w:sz w:val="24"/>
+          <w:szCs w:val="24"/>
+        </w:rPr>
+        <w:t>相互印证，</w:t>
+      </w:r>
+      <w:r>
+        <w:rPr>
+          <w:rFonts w:ascii="宋体" w:eastAsia="宋体" w:hAnsi="宋体" w:cs="宋体" w:hint="eastAsia"/>
+          <w:kern w:val="0"/>
+          <w:sz w:val="24"/>
+          <w:szCs w:val="24"/>
+        </w:rPr>
+        <w:t>暴露出</w:t>
+      </w:r>
+      <w:r>
+        <w:rPr>
+          <w:rFonts w:ascii="宋体" w:eastAsia="宋体" w:hAnsi="宋体" w:cs="宋体"/>
+          <w:kern w:val="0"/>
+          <w:sz w:val="24"/>
+          <w:szCs w:val="24"/>
+        </w:rPr>
+        <w:t>活体动物网络交易背后一条成熟的、</w:t>
+      </w:r>
+      <w:r>
+        <w:rPr>
+          <w:rFonts w:ascii="宋体" w:eastAsia="宋体" w:hAnsi="宋体" w:cs="宋体" w:hint="eastAsia"/>
+          <w:kern w:val="0"/>
+          <w:sz w:val="24"/>
+          <w:szCs w:val="24"/>
+        </w:rPr>
+        <w:t>逃离</w:t>
+      </w:r>
+      <w:r>
+        <w:rPr>
+          <w:rFonts w:ascii="宋体" w:eastAsia="宋体" w:hAnsi="宋体" w:cs="宋体"/>
+          <w:kern w:val="0"/>
+          <w:sz w:val="24"/>
+          <w:szCs w:val="24"/>
+        </w:rPr>
+        <w:t>监管的“地下”流通网络。</w:t>
       </w:r>
     </w:p>
     <w:p>
@@ -214,9 +286,6 @@
     <w:p>
       <w:pPr>
         <w:pStyle w:val="a3"/>
-        <w:rPr>
-          <w:rFonts w:hint="eastAsia"/>
-        </w:rPr>
       </w:pPr>
       <w:r>
         <w:t>脱离法定检验检疫与卫生运输规范的网络宠物交易，不仅是</w:t>

</xml_diff>

<commit_message>
vault backup: 2026-06-17 11:19:24
</commit_message>
<xml_diff>
--- a/essay.docx
+++ b/essay.docx
@@ -202,7 +202,7 @@
         <w:t>法规</w:t>
       </w:r>
       <w:r>
-        <w:t>的强制性约束</w:t>
+        <w:t>的约束</w:t>
       </w:r>
       <w:r>
         <w:rPr>
@@ -211,13 +211,19 @@
         <w:t>下进行</w:t>
       </w:r>
       <w:r>
-        <w:t>。评价网购宠物行为的合法性，</w:t>
+        <w:t>。</w:t>
       </w:r>
       <w:r>
         <w:rPr>
           <w:rFonts w:hint="eastAsia"/>
         </w:rPr>
-        <w:t>需结合</w:t>
+        <w:t>因此需</w:t>
+      </w:r>
+      <w:r>
+        <w:rPr>
+          <w:rFonts w:hint="eastAsia"/>
+        </w:rPr>
+        <w:t>结合</w:t>
       </w:r>
       <w:r>
         <w:t>《中华人民共和国动物防疫法》</w:t>
@@ -381,14 +387,20 @@
         <w:pStyle w:val="a3"/>
       </w:pPr>
       <w:r>
-        <w:t>其错误不在于交易从线下转移到了线上，而在于网络经营主体与物流承运人利用数字经济的虚拟性与跨地域性，实施了</w:t>
-      </w:r>
-      <w:r>
-        <w:rPr>
-          <w:b/>
-          <w:bCs/>
-        </w:rPr>
-        <w:t>系统性的法定防疫义务规避</w:t>
+        <w:t>其错误不在于交易从线下转移到了线上，而在于网络经营主体与物流承运人利用数字经济的虚拟性与跨地域性，</w:t>
+      </w:r>
+      <w:r>
+        <w:rPr>
+          <w:rFonts w:hint="eastAsia"/>
+        </w:rPr>
+        <w:t>未履行</w:t>
+      </w:r>
+      <w:r>
+        <w:rPr>
+          <w:b/>
+          <w:bCs/>
+        </w:rPr>
+        <w:t>法定防疫义务</w:t>
       </w:r>
       <w:r>
         <w:t>。这种行为绝非简单的“行业规范不完善”，而是对《中华人民共和国动物防疫法》确立的“预防为主、全链条监管”基本法律制度的实质性破坏。</w:t>

</xml_diff>

<commit_message>
vault backup: 2026-06-17 11:34:25
</commit_message>
<xml_diff>
--- a/essay.docx
+++ b/essay.docx
@@ -369,7 +369,16 @@
         <w:pStyle w:val="a3"/>
       </w:pPr>
       <w:r>
-        <w:t>网络宠物交易作为一种商业模式本身并无对错，但当前普遍存在的“无证寄递”、“盲盒发货”现象，在法理定性上是</w:t>
+        <w:t>网络宠物交易作为一种商业模式本身</w:t>
+      </w:r>
+      <w:r>
+        <w:rPr>
+          <w:rFonts w:hint="eastAsia"/>
+        </w:rPr>
+        <w:t>并不是要否决的</w:t>
+      </w:r>
+      <w:r>
+        <w:t>，但当前普遍存在的“无证寄递”现象，在法理上是</w:t>
       </w:r>
       <w:r>
         <w:rPr>
@@ -379,15 +388,16 @@
         <w:t>绝对错误</w:t>
       </w:r>
       <w:r>
-        <w:t>的。</w:t>
-      </w:r>
-    </w:p>
-    <w:p>
-      <w:pPr>
-        <w:pStyle w:val="a3"/>
-      </w:pPr>
-      <w:r>
-        <w:t>其错误不在于交易从线下转移到了线上，而在于网络经营主体与物流承运人利用数字经济的虚拟性与跨地域性，</w:t>
+        <w:t>的。其错误不在于</w:t>
+      </w:r>
+      <w:r>
+        <w:rPr>
+          <w:rFonts w:hint="eastAsia"/>
+        </w:rPr>
+        <w:t>将</w:t>
+      </w:r>
+      <w:r>
+        <w:t>交易从线下转移到了线上，而在于网络经营主体与物流承运人</w:t>
       </w:r>
       <w:r>
         <w:rPr>
@@ -403,7 +413,19 @@
         <w:t>法定防疫义务</w:t>
       </w:r>
       <w:r>
-        <w:t>。这种行为绝非简单的“行业规范不完善”，而是对《中华人民共和国动物防疫法》确立的“预防为主、全链条监管”基本法律制度的实质性破坏。</w:t>
+        <w:rPr>
+          <w:rFonts w:hint="eastAsia"/>
+        </w:rPr>
+        <w:t>，严重</w:t>
+      </w:r>
+      <w:r>
+        <w:rPr>
+          <w:rFonts w:hint="eastAsia"/>
+        </w:rPr>
+        <w:t>破坏了</w:t>
+      </w:r>
+      <w:r>
+        <w:t>《中华人民共和国动物防疫法》确立的“预防为主、全链条监管”基本法律制度。</w:t>
       </w:r>
     </w:p>
     <w:p>

</xml_diff>

<commit_message>
vault backup: 2026-06-18 10:55:52
</commit_message>
<xml_diff>
--- a/essay.docx
+++ b/essay.docx
@@ -427,14 +427,8 @@
       <w:r>
         <w:t>《中华人民共和国动物防疫法》确立的“预防为主、全链条监管”基本法律制度。</w:t>
       </w:r>
-    </w:p>
-    <w:p>
-      <w:pPr>
-        <w:pStyle w:val="a3"/>
-      </w:pPr>
-      <w:r>
-        <w:lastRenderedPageBreak/>
-        <w:t>从动物卫生法制与公共管理的交叉视角来看，该现象的核心之“错”集中体现在以下三个层面：</w:t>
+      <w:r>
+        <w:t>从动物卫生法制视角来看，该现象的核心之“错”集中体现在以下三个层面：</w:t>
       </w:r>
     </w:p>
     <w:p>
@@ -446,10 +440,55 @@
           <w:b/>
           <w:bCs/>
         </w:rPr>
-        <w:t>1. 错在公法义务的私人卸责与成本转嫁</w:t>
-      </w:r>
-      <w:r>
-        <w:t xml:space="preserve"> 动物检疫制度的设立，是为了对抗疫病传播这一“负外部性”风险。法定检疫程序、合规的运输设备都需要付出时间与资金成本。网络商家与违规中介为了压缩商业成本、实现利益最大化，选择放弃检疫申报与合规运输。这在法理上是将本应由经营者承担的“生物安全防范成本”，非法转嫁给了无辜的消费者（承担治疗费用）与全社会（承担疫病爆发风险）。</w:t>
+        <w:lastRenderedPageBreak/>
+        <w:t>1. 义务的私人卸责与成本转嫁</w:t>
+      </w:r>
+      <w:r>
+        <w:t xml:space="preserve"> </w:t>
+      </w:r>
+    </w:p>
+    <w:p>
+      <w:pPr>
+        <w:pStyle w:val="a3"/>
+      </w:pPr>
+      <w:r>
+        <w:t>动物检疫制度的设立，是为了对抗疫病传播</w:t>
+      </w:r>
+      <w:r>
+        <w:rPr>
+          <w:rFonts w:hint="eastAsia"/>
+        </w:rPr>
+        <w:t>的潜在风险</w:t>
+      </w:r>
+      <w:r>
+        <w:t>。网络商家与违规中介为了压缩</w:t>
+      </w:r>
+      <w:r>
+        <w:rPr>
+          <w:rFonts w:hint="eastAsia"/>
+        </w:rPr>
+        <w:t>检疫流程的时间与金钱</w:t>
+      </w:r>
+      <w:r>
+        <w:t>成本、实现利益最大化，选择放弃检疫申报与合规运输。</w:t>
+      </w:r>
+      <w:r>
+        <w:rPr>
+          <w:rFonts w:hint="eastAsia"/>
+        </w:rPr>
+        <w:t>这本质上就是将</w:t>
+      </w:r>
+      <w:r>
+        <w:t>由经营者承担的“生物安全防范成本”，非法转嫁给了</w:t>
+      </w:r>
+      <w:r>
+        <w:rPr>
+          <w:rFonts w:hint="eastAsia"/>
+        </w:rPr>
+        <w:t>无辜的消费者</w:t>
+      </w:r>
+      <w:r>
+        <w:t>与全社会。</w:t>
       </w:r>
     </w:p>
     <w:p>
@@ -461,25 +500,92 @@
           <w:b/>
           <w:bCs/>
         </w:rPr>
-        <w:t>2. 错在物理隔断了行政监管的追踪链条</w:t>
-      </w:r>
-      <w:r>
-        <w:t xml:space="preserve"> 传统的动物卫生监督依赖于“产地检疫—运输查验—落地报告”的线性闭环。网络宠物交易错在利用电商平台与快递网点的多层嵌套，人为制造了“信息黑箱”。承运人“闭眼收寄”，导致执法部门无法掌握活体动物的真实来源与流向，使得《动物防疫法》赋予行政机关的流行病学调查权与应急处置权在网络交易面前彻底失效。</w:t>
-      </w:r>
-    </w:p>
-    <w:p>
-      <w:pPr>
-        <w:pStyle w:val="a3"/>
-      </w:pPr>
-      <w:r>
-        <w:rPr>
+        <w:t>2. 物理</w:t>
+      </w:r>
+      <w:r>
+        <w:rPr>
+          <w:rFonts w:hint="eastAsia"/>
           <w:b/>
           <w:bCs/>
         </w:rPr>
-        <w:t>3. 错在诱发了“劣币驱逐良币”的负面市场效应</w:t>
-      </w:r>
-      <w:r>
-        <w:t xml:space="preserve"> 当违规经营者通过逃避检疫获得低成本优势，且未受到严厉的行政处罚时，其违法收益远大于违法成本。这种现象在客观上惩罚了那些严格按照法规进行疫苗接种、申报检疫、使用专业宠物托运的合规经营者，最终导致整个网络宠物市场陷入法不责众的恶性循环。</w:t>
+        <w:t>熔断</w:t>
+      </w:r>
+      <w:r>
+        <w:rPr>
+          <w:b/>
+          <w:bCs/>
+        </w:rPr>
+        <w:t>行政监管</w:t>
+      </w:r>
+      <w:r>
+        <w:t xml:space="preserve"> </w:t>
+      </w:r>
+    </w:p>
+    <w:p>
+      <w:pPr>
+        <w:pStyle w:val="a3"/>
+      </w:pPr>
+      <w:r>
+        <w:t>传统的动物卫生监督依赖于“产地检疫—运输查验—落地报告”的线性闭环。网络宠物交易利用电商平台与快递网点的多层嵌套，人为制造了“信息黑箱”</w:t>
+      </w:r>
+      <w:r>
+        <w:rPr>
+          <w:rFonts w:hint="eastAsia"/>
+        </w:rPr>
+        <w:t>，</w:t>
+      </w:r>
+      <w:r>
+        <w:t>导致执法部门无法掌握活体动物的真实来源与流向，使得《动物防疫法》赋予行政机关的流行病学调查权与应急处置权在网络交易面前彻底失效。</w:t>
+      </w:r>
+    </w:p>
+    <w:p>
+      <w:pPr>
+        <w:pStyle w:val="a3"/>
+      </w:pPr>
+      <w:r>
+        <w:rPr>
+          <w:b/>
+          <w:bCs/>
+        </w:rPr>
+        <w:t>3. 诱发“劣币驱逐良币”的市场效应</w:t>
+      </w:r>
+      <w:r>
+        <w:t xml:space="preserve"> </w:t>
+      </w:r>
+    </w:p>
+    <w:p>
+      <w:pPr>
+        <w:pStyle w:val="a3"/>
+      </w:pPr>
+      <w:r>
+        <w:t>当违规经营者通过逃避检疫获得低成本优势，且未受到</w:t>
+      </w:r>
+      <w:r>
+        <w:rPr>
+          <w:rFonts w:hint="eastAsia"/>
+        </w:rPr>
+        <w:t>相应的</w:t>
+      </w:r>
+      <w:r>
+        <w:t>处罚时，其违法收益远大于违法成本。这种现象</w:t>
+      </w:r>
+      <w:r>
+        <w:rPr>
+          <w:rFonts w:hint="eastAsia"/>
+        </w:rPr>
+        <w:t>反倒是“惩罚”</w:t>
+      </w:r>
+      <w:r>
+        <w:t>那些严格</w:t>
+      </w:r>
+      <w:r>
+        <w:rPr>
+          <w:rFonts w:hint="eastAsia"/>
+        </w:rPr>
+        <w:t>遵照执行法规流程</w:t>
+      </w:r>
+      <w:r>
+        <w:t>的合规经营者，导致整个网络宠物市场陷入法不责众的恶性循环。</w:t>
       </w:r>
     </w:p>
     <w:p/>
@@ -516,20 +622,92 @@
         <w:spacing w:before="100" w:beforeAutospacing="1" w:after="100" w:afterAutospacing="1"/>
         <w:jc w:val="left"/>
         <w:rPr>
-          <w:rFonts w:ascii="宋体" w:eastAsia="宋体" w:hAnsi="宋体" w:cs="宋体"/>
-          <w:kern w:val="0"/>
-          <w:sz w:val="24"/>
-          <w:szCs w:val="24"/>
-        </w:rPr>
-      </w:pPr>
-      <w:r>
-        <w:rPr>
-          <w:rFonts w:ascii="宋体" w:eastAsia="宋体" w:hAnsi="宋体" w:cs="宋体"/>
-          <w:kern w:val="0"/>
-          <w:sz w:val="24"/>
-          <w:szCs w:val="24"/>
-        </w:rPr>
-        <w:t>网络宠物交易乱象的长期存在，并非单纯的市场道德败坏，而是传统动物卫生法制在遭遇数字经济冲击时，引发的系统性“规制失灵”与基层执法结构性困境的集中爆发。</w:t>
+          <w:rFonts w:ascii="宋体" w:eastAsia="宋体" w:hAnsi="宋体" w:cs="宋体" w:hint="eastAsia"/>
+          <w:kern w:val="0"/>
+          <w:sz w:val="24"/>
+          <w:szCs w:val="24"/>
+        </w:rPr>
+      </w:pPr>
+      <w:r>
+        <w:rPr>
+          <w:rFonts w:ascii="宋体" w:eastAsia="宋体" w:hAnsi="宋体" w:cs="宋体"/>
+          <w:kern w:val="0"/>
+          <w:sz w:val="24"/>
+          <w:szCs w:val="24"/>
+        </w:rPr>
+        <w:t>网络宠物交易乱象</w:t>
+      </w:r>
+      <w:r>
+        <w:rPr>
+          <w:rFonts w:ascii="宋体" w:eastAsia="宋体" w:hAnsi="宋体" w:cs="宋体" w:hint="eastAsia"/>
+          <w:kern w:val="0"/>
+          <w:sz w:val="24"/>
+          <w:szCs w:val="24"/>
+        </w:rPr>
+        <w:t>存在的背后</w:t>
+      </w:r>
+      <w:r>
+        <w:rPr>
+          <w:rFonts w:ascii="宋体" w:eastAsia="宋体" w:hAnsi="宋体" w:cs="宋体"/>
+          <w:kern w:val="0"/>
+          <w:sz w:val="24"/>
+          <w:szCs w:val="24"/>
+        </w:rPr>
+        <w:t>并</w:t>
+      </w:r>
+      <w:r>
+        <w:rPr>
+          <w:rFonts w:ascii="宋体" w:eastAsia="宋体" w:hAnsi="宋体" w:cs="宋体" w:hint="eastAsia"/>
+          <w:kern w:val="0"/>
+          <w:sz w:val="24"/>
+          <w:szCs w:val="24"/>
+        </w:rPr>
+        <w:t>不是</w:t>
+      </w:r>
+      <w:r>
+        <w:rPr>
+          <w:rFonts w:ascii="宋体" w:eastAsia="宋体" w:hAnsi="宋体" w:cs="宋体"/>
+          <w:kern w:val="0"/>
+          <w:sz w:val="24"/>
+          <w:szCs w:val="24"/>
+        </w:rPr>
+        <w:t>单纯的市场道德败坏，而是传统动物卫生法制在遭遇数字经济冲击时</w:t>
+      </w:r>
+      <w:r>
+        <w:rPr>
+          <w:rFonts w:ascii="宋体" w:eastAsia="宋体" w:hAnsi="宋体" w:cs="宋体" w:hint="eastAsia"/>
+          <w:kern w:val="0"/>
+          <w:sz w:val="24"/>
+          <w:szCs w:val="24"/>
+        </w:rPr>
+        <w:t>暴露出的系统性</w:t>
+      </w:r>
+      <w:r>
+        <w:rPr>
+          <w:rFonts w:ascii="宋体" w:eastAsia="宋体" w:hAnsi="宋体" w:cs="宋体"/>
+          <w:kern w:val="0"/>
+          <w:sz w:val="24"/>
+          <w:szCs w:val="24"/>
+        </w:rPr>
+        <w:t>与结构性的</w:t>
+      </w:r>
+      <w:r>
+        <w:rPr>
+          <w:rFonts w:ascii="宋体" w:eastAsia="宋体" w:hAnsi="宋体" w:cs="宋体" w:hint="eastAsia"/>
+          <w:kern w:val="0"/>
+          <w:sz w:val="24"/>
+          <w:szCs w:val="24"/>
+        </w:rPr>
+        <w:t>交叉困境</w:t>
+      </w:r>
+      <w:r>
+        <w:rPr>
+          <w:rFonts w:ascii="宋体" w:eastAsia="宋体" w:hAnsi="宋体" w:cs="宋体" w:hint="eastAsia"/>
+          <w:kern w:val="0"/>
+          <w:sz w:val="24"/>
+          <w:szCs w:val="24"/>
+        </w:rPr>
+        <w:t>：</w:t>
       </w:r>
     </w:p>
     <w:p>
@@ -556,7 +734,7 @@
           <w:sz w:val="27"/>
           <w:szCs w:val="27"/>
         </w:rPr>
-        <w:t>（一）立法层面的“规制失灵”：传统法律框架与数字经济的错位</w:t>
+        <w:t>（一）立法层面：传统法律框架与数字经济的错位</w:t>
       </w:r>
     </w:p>
     <w:p>
@@ -578,94 +756,31 @@
           <w:sz w:val="24"/>
           <w:szCs w:val="24"/>
         </w:rPr>
-        <w:t>现行《中华人民共和国动物防疫法》的立法逻辑，深植于传统的畜禽规模化养殖与线下点对点调运模式。面对高度去中心化的网络宠物交易，传统线性规制手段陷入了明显的失灵状态。</w:t>
-      </w:r>
-    </w:p>
-    <w:p>
-      <w:pPr>
-        <w:widowControl/>
-        <w:numPr>
-          <w:ilvl w:val="0"/>
-          <w:numId w:val="2"/>
-        </w:numPr>
-        <w:spacing w:before="100" w:beforeAutospacing="1" w:after="100" w:afterAutospacing="1"/>
-        <w:jc w:val="left"/>
-        <w:rPr>
-          <w:rFonts w:ascii="宋体" w:eastAsia="宋体" w:hAnsi="宋体" w:cs="宋体"/>
-          <w:kern w:val="0"/>
-          <w:sz w:val="24"/>
-          <w:szCs w:val="24"/>
-        </w:rPr>
-      </w:pPr>
-      <w:r>
-        <w:rPr>
-          <w:rFonts w:ascii="宋体" w:eastAsia="宋体" w:hAnsi="宋体" w:cs="宋体"/>
-          <w:b/>
-          <w:bCs/>
-          <w:kern w:val="0"/>
-          <w:sz w:val="24"/>
-          <w:szCs w:val="24"/>
-        </w:rPr>
-        <w:t>规制对象的碎片化与检疫标准的滞后</w:t>
+        <w:t>现行《中华人民共和国动物防疫法》的立法逻辑，深植于传统的畜禽规模化养殖与线下点对点</w:t>
+      </w:r>
+      <w:r>
+        <w:rPr>
+          <w:rFonts w:ascii="宋体" w:eastAsia="宋体" w:hAnsi="宋体" w:cs="宋体" w:hint="eastAsia"/>
+          <w:kern w:val="0"/>
+          <w:sz w:val="24"/>
+          <w:szCs w:val="24"/>
+        </w:rPr>
+        <w:t>的</w:t>
+      </w:r>
+      <w:r>
+        <w:rPr>
+          <w:rFonts w:ascii="宋体" w:eastAsia="宋体" w:hAnsi="宋体" w:cs="宋体"/>
+          <w:kern w:val="0"/>
+          <w:sz w:val="24"/>
+          <w:szCs w:val="24"/>
+        </w:rPr>
+        <w:t>调运模式。面对高度去中心化的网络交易，现行法律对于这种碎片化的“C2C”或“B2C”零散发货模式，缺乏低成本、高效率的专项检疫申报路径，导致守法成本过高，客观上“倒逼”部分商户选择非法规避。</w:t>
       </w:r>
     </w:p>
     <w:p>
       <w:pPr>
         <w:widowControl/>
         <w:spacing w:before="100" w:beforeAutospacing="1" w:after="100" w:afterAutospacing="1"/>
-        <w:ind w:left="720"/>
-        <w:jc w:val="left"/>
-        <w:rPr>
-          <w:rFonts w:ascii="宋体" w:eastAsia="宋体" w:hAnsi="宋体" w:cs="宋体"/>
-          <w:kern w:val="0"/>
-          <w:sz w:val="24"/>
-          <w:szCs w:val="24"/>
-        </w:rPr>
-      </w:pPr>
-      <w:r>
-        <w:rPr>
-          <w:rFonts w:ascii="宋体" w:eastAsia="宋体" w:hAnsi="宋体" w:cs="宋体"/>
-          <w:kern w:val="0"/>
-          <w:sz w:val="24"/>
-          <w:szCs w:val="24"/>
-        </w:rPr>
-        <w:t>传统产地检疫主要针对集中出栏的农畜产品。而网络宠物交易呈现出明显的“散、小、多”特征，交易主体多为个人繁育者或小型犬猫舍。现行法律对于这种碎片化的“C2C”或“B2C”零散发货模式，缺乏低成本、高效率的专项检疫申报路径，导致守法成本过高，客观上“倒逼”部分商户选择非法规避。</w:t>
-      </w:r>
-    </w:p>
-    <w:p>
-      <w:pPr>
-        <w:widowControl/>
-        <w:numPr>
-          <w:ilvl w:val="0"/>
-          <w:numId w:val="2"/>
-        </w:numPr>
-        <w:spacing w:before="100" w:beforeAutospacing="1" w:after="100" w:afterAutospacing="1"/>
-        <w:jc w:val="left"/>
-        <w:rPr>
-          <w:rFonts w:ascii="宋体" w:eastAsia="宋体" w:hAnsi="宋体" w:cs="宋体"/>
-          <w:kern w:val="0"/>
-          <w:sz w:val="24"/>
-          <w:szCs w:val="24"/>
-        </w:rPr>
-      </w:pPr>
-      <w:r>
-        <w:rPr>
-          <w:rFonts w:ascii="宋体" w:eastAsia="宋体" w:hAnsi="宋体" w:cs="宋体"/>
-          <w:b/>
-          <w:bCs/>
-          <w:kern w:val="0"/>
-          <w:sz w:val="24"/>
-          <w:szCs w:val="24"/>
-        </w:rPr>
-        <w:lastRenderedPageBreak/>
-        <w:t>“网络守门人”法定协同责任的缺位</w:t>
-      </w:r>
-    </w:p>
-    <w:p>
-      <w:pPr>
-        <w:widowControl/>
-        <w:spacing w:before="100" w:beforeAutospacing="1" w:after="100" w:afterAutospacing="1"/>
-        <w:ind w:left="720"/>
         <w:jc w:val="left"/>
         <w:rPr>
           <w:rFonts w:ascii="宋体" w:eastAsia="宋体" w:hAnsi="宋体" w:cs="宋体"/>
@@ -730,16 +845,13 @@
           <w:sz w:val="24"/>
           <w:szCs w:val="24"/>
         </w:rPr>
+        <w:lastRenderedPageBreak/>
         <w:t>在基层动物卫生监督的末端，执法资源匮乏与激增的监管任务之间存在着不可调和的矛盾。根据韩志明（2018）阐释的“街头官僚”理论，一线行政执法者在面临系统性资源约束与任务超载时，往往被迫采取“适应性策略”或选择性执法（韩志明，2018）。</w:t>
       </w:r>
     </w:p>
     <w:p>
       <w:pPr>
         <w:widowControl/>
-        <w:numPr>
-          <w:ilvl w:val="0"/>
-          <w:numId w:val="3"/>
-        </w:numPr>
         <w:spacing w:before="100" w:beforeAutospacing="1" w:after="100" w:afterAutospacing="1"/>
         <w:jc w:val="left"/>
         <w:rPr>
@@ -752,57 +864,17 @@
       <w:r>
         <w:rPr>
           <w:rFonts w:ascii="宋体" w:eastAsia="宋体" w:hAnsi="宋体" w:cs="宋体"/>
-          <w:b/>
-          <w:bCs/>
-          <w:kern w:val="0"/>
-          <w:sz w:val="24"/>
-          <w:szCs w:val="24"/>
-        </w:rPr>
-        <w:t>检疫业务激增与“小马拉大车”的容量极限</w:t>
-      </w:r>
-      <w:r>
-        <w:rPr>
-          <w:rFonts w:ascii="宋体" w:eastAsia="宋体" w:hAnsi="宋体" w:cs="宋体"/>
-          <w:kern w:val="0"/>
-          <w:sz w:val="24"/>
-          <w:szCs w:val="24"/>
-        </w:rPr>
-        <w:t xml:space="preserve"> 随着畜牧业规模化及互联网流通的发展，基层动物检疫业务量本身就在持续爆发。以云南省腾冲市为例，仅2021-2025年间，基层需应对的畜禽及各类动物检疫数量极为庞大且种类复杂，激增的工作量直接推高了误检或漏检的系统性风险。在此高压常态下，基层官方兽医仅应对传统畜牧业的检疫申报已捉襟见肘，根本无力抽身对隐蔽、分散的网络宠物繁育暗流实施主动摸排。 </w:t>
-      </w:r>
-    </w:p>
-    <w:p>
-      <w:pPr>
-        <w:widowControl/>
-        <w:numPr>
-          <w:ilvl w:val="0"/>
-          <w:numId w:val="3"/>
-        </w:numPr>
-        <w:spacing w:before="100" w:beforeAutospacing="1" w:after="100" w:afterAutospacing="1"/>
-        <w:jc w:val="left"/>
-        <w:rPr>
-          <w:rFonts w:ascii="宋体" w:eastAsia="宋体" w:hAnsi="宋体" w:cs="宋体"/>
-          <w:kern w:val="0"/>
-          <w:sz w:val="24"/>
-          <w:szCs w:val="24"/>
-        </w:rPr>
-      </w:pPr>
-      <w:r>
-        <w:rPr>
-          <w:rFonts w:ascii="宋体" w:eastAsia="宋体" w:hAnsi="宋体" w:cs="宋体"/>
-          <w:b/>
-          <w:bCs/>
-          <w:kern w:val="0"/>
-          <w:sz w:val="24"/>
-          <w:szCs w:val="24"/>
-        </w:rPr>
-        <w:t>基层体制改革引发的“权责相悖”</w:t>
+          <w:kern w:val="0"/>
+          <w:sz w:val="24"/>
+          <w:szCs w:val="24"/>
+        </w:rPr>
+        <w:t xml:space="preserve">随着畜牧业规模化及互联网流通的发展，基层动物检疫业务量本身就在持续爆发。以云南省腾冲市为例，仅2021-2025年间，基层需应对的畜禽及各类动物检疫数量极为庞大且种类复杂，激增的工作量直接推高了误检或漏检的系统性风险。在此高压常态下，基层官方兽医仅应对传统畜牧业的检疫申报已捉襟见肘，根本无力抽身对隐蔽、分散的网络宠物繁育暗流实施主动摸排。 </w:t>
       </w:r>
     </w:p>
     <w:p>
       <w:pPr>
         <w:widowControl/>
         <w:spacing w:before="100" w:beforeAutospacing="1" w:after="100" w:afterAutospacing="1"/>
-        <w:ind w:left="720"/>
         <w:jc w:val="left"/>
         <w:rPr>
           <w:rFonts w:ascii="宋体" w:eastAsia="宋体" w:hAnsi="宋体" w:cs="宋体"/>
@@ -867,16 +939,12 @@
           <w:sz w:val="24"/>
           <w:szCs w:val="24"/>
         </w:rPr>
-        <w:t>网络活体宠物交易天然具有跨越物理边界的属性，这与我国现行的动物卫生行政监管体制产生了剧烈摩擦。</w:t>
+        <w:t>网络活体宠物交易天然具有跨越物理边界的属性，这与我国现行的动物卫生行政监管体制产生了剧烈摩擦。违规寄递的宠物往往卖家在A省，经由B省物流中转，最终到达C省买家手中。这种分离式交易使得坚持“属地管辖”原则的地方农业执法队伍面临极大的异地调查与取证壁垒，导致违法行为难以被全链条追溯。</w:t>
       </w:r>
     </w:p>
     <w:p>
       <w:pPr>
         <w:widowControl/>
-        <w:numPr>
-          <w:ilvl w:val="0"/>
-          <w:numId w:val="4"/>
-        </w:numPr>
         <w:spacing w:before="100" w:beforeAutospacing="1" w:after="100" w:afterAutospacing="1"/>
         <w:jc w:val="left"/>
         <w:rPr>
@@ -889,74 +957,11 @@
       <w:r>
         <w:rPr>
           <w:rFonts w:ascii="宋体" w:eastAsia="宋体" w:hAnsi="宋体" w:cs="宋体"/>
-          <w:b/>
-          <w:bCs/>
-          <w:kern w:val="0"/>
-          <w:sz w:val="24"/>
-          <w:szCs w:val="24"/>
-        </w:rPr>
-        <w:t>“属地管辖”对抗“跨域流通”的取证困境</w:t>
-      </w:r>
-    </w:p>
-    <w:p>
-      <w:pPr>
-        <w:widowControl/>
-        <w:spacing w:before="100" w:beforeAutospacing="1" w:after="100" w:afterAutospacing="1"/>
-        <w:ind w:left="720"/>
-        <w:jc w:val="left"/>
-        <w:rPr>
-          <w:rFonts w:ascii="宋体" w:eastAsia="宋体" w:hAnsi="宋体" w:cs="宋体"/>
-          <w:kern w:val="0"/>
-          <w:sz w:val="24"/>
-          <w:szCs w:val="24"/>
-        </w:rPr>
-      </w:pPr>
-      <w:r>
-        <w:rPr>
-          <w:rFonts w:ascii="宋体" w:eastAsia="宋体" w:hAnsi="宋体" w:cs="宋体"/>
-          <w:kern w:val="0"/>
-          <w:sz w:val="24"/>
-          <w:szCs w:val="24"/>
-        </w:rPr>
-        <w:t>违规寄递的宠物往往卖家在A省，经由B省物流中转，最终到达C省买家手中。这种分离式交易使得坚持“属地管辖”原则的地方农业执法队伍面临极大的异地调查与取证壁垒，导致违法行为难以被全链条追溯。</w:t>
-      </w:r>
-    </w:p>
-    <w:p>
-      <w:pPr>
-        <w:widowControl/>
-        <w:numPr>
-          <w:ilvl w:val="0"/>
-          <w:numId w:val="4"/>
-        </w:numPr>
-        <w:spacing w:before="100" w:beforeAutospacing="1" w:after="100" w:afterAutospacing="1"/>
-        <w:jc w:val="left"/>
-        <w:rPr>
-          <w:rFonts w:ascii="宋体" w:eastAsia="宋体" w:hAnsi="宋体" w:cs="宋体"/>
-          <w:kern w:val="0"/>
-          <w:sz w:val="24"/>
-          <w:szCs w:val="24"/>
-        </w:rPr>
-      </w:pPr>
-      <w:r>
-        <w:rPr>
-          <w:rFonts w:ascii="宋体" w:eastAsia="宋体" w:hAnsi="宋体" w:cs="宋体"/>
-          <w:b/>
-          <w:bCs/>
-          <w:kern w:val="0"/>
-          <w:sz w:val="24"/>
-          <w:szCs w:val="24"/>
-        </w:rPr>
-        <w:lastRenderedPageBreak/>
-        <w:t>多头管理下的部门协同阻滞</w:t>
-      </w:r>
-      <w:r>
-        <w:rPr>
-          <w:rFonts w:ascii="宋体" w:eastAsia="宋体" w:hAnsi="宋体" w:cs="宋体"/>
-          <w:kern w:val="0"/>
-          <w:sz w:val="24"/>
-          <w:szCs w:val="24"/>
-        </w:rPr>
-        <w:t xml:space="preserve"> 动物防疫检疫工作横跨多个行政管理领域，但在实际执行中，部门间协作往往流于形式，多头管理与监管盲区并存。目前，农业农村部门（管检疫）、邮政管理部门（管快递）、市场监管部门（管平台）之间缺乏法定的数据强制共享机制。农业部门的检疫数据无法实时推送给物流企业进行自动拦截，致使《动物防疫法》规定的“承运人查验责任”因缺乏技术接口而沦为空谈。 </w:t>
+          <w:kern w:val="0"/>
+          <w:sz w:val="24"/>
+          <w:szCs w:val="24"/>
+        </w:rPr>
+        <w:t xml:space="preserve">动物防疫检疫工作横跨多个行政管理领域，但在实际执行中，部门间协作往往流于形式，多头管理与监管盲区并存。目前，农业农村部门（管检疫）、邮政管理部门（管快递）、市场监管部门（管平台）之间缺乏法定的数据强制共享机制。农业部门的检疫数据无法实时推送给物流企业进行自动拦截，致使《动物防疫法》规定的“承运人查验责任”因缺乏技术接口而沦为空谈。 </w:t>
       </w:r>
     </w:p>
     <w:p>
@@ -1021,61 +1026,84 @@
         <w:pStyle w:val="a3"/>
       </w:pPr>
       <w:r>
+        <w:lastRenderedPageBreak/>
         <w:t>针对网络宠物交易中暴露出的规制失灵与体制瓶颈，单纯依靠增加基层兽医编制或开展短期“运动式执法”已无法触及病灶。必须实现从“线下人工盯防”向“全链条数字治理”的法治范式转型，构建“法律授权—技术赋能—部门协同”的治理闭环。</w:t>
       </w:r>
     </w:p>
     <w:p>
       <w:pPr>
         <w:pStyle w:val="3"/>
-      </w:pPr>
-      <w:r>
-        <w:t>（一）完善电子商务与动物防疫的法律衔接，压实“守门人”责任</w:t>
-      </w:r>
-    </w:p>
-    <w:p>
-      <w:pPr>
-        <w:pStyle w:val="a3"/>
-      </w:pPr>
-      <w:r>
-        <w:t>打破网络交易“规制失灵”的核心，在于赋予电商平台强制性的协管义务，切断未经检疫宠物的线上展示与交易渠道。</w:t>
-      </w:r>
-    </w:p>
-    <w:p>
-      <w:pPr>
-        <w:pStyle w:val="a3"/>
         <w:numPr>
           <w:ilvl w:val="0"/>
-          <w:numId w:val="5"/>
+          <w:numId w:val="10"/>
         </w:numPr>
       </w:pPr>
       <w:r>
-        <w:rPr>
-          <w:b/>
-          <w:bCs/>
-        </w:rPr>
-        <w:t>确立平台前置审核义务</w:t>
-      </w:r>
-      <w:r>
-        <w:t>：在《动物防疫法》或《电子商务法》的后续实施条例中，明确将“官方动物检疫合格证明”作为活体动物（含异宠）网络上架的法定前置要件。</w:t>
+        <w:t>完善电子商务与动物防疫的法律衔接，压实“守门人”责任</w:t>
       </w:r>
     </w:p>
     <w:p>
       <w:pPr>
         <w:pStyle w:val="a3"/>
+      </w:pPr>
+      <w:r>
+        <w:t>打破网络交易“规制失灵”的</w:t>
+      </w:r>
+      <w:r>
+        <w:rPr>
+          <w:rFonts w:hint="eastAsia"/>
+        </w:rPr>
+        <w:t>关键</w:t>
+      </w:r>
+      <w:r>
+        <w:t>在于赋予电商平台强制性的协管义务，切断未经检疫宠物的线上展示与交易渠道。</w:t>
+      </w:r>
+      <w:r>
+        <w:rPr>
+          <w:rFonts w:hint="eastAsia"/>
+        </w:rPr>
+        <w:t>因此可以</w:t>
+      </w:r>
+      <w:r>
+        <w:t>在《动物防疫法》或《电子商务法》的后续实施条例中，明确将“官方动物检疫合格证明”作为活体动物（含异宠）网络上架的法定前置要件。</w:t>
+      </w:r>
+      <w:r>
+        <w:rPr>
+          <w:rFonts w:hint="eastAsia"/>
+        </w:rPr>
+        <w:t>并</w:t>
+      </w:r>
+      <w:r>
+        <w:t>要求平台对无法提供检疫证明、伪造证明或因违规运输引发重大死亡事件的商户，实施断开链接、封禁账号等处置，并将线索依法移交农业综合行政执法部门。</w:t>
+      </w:r>
+    </w:p>
+    <w:p>
+      <w:pPr>
+        <w:pStyle w:val="3"/>
         <w:numPr>
           <w:ilvl w:val="0"/>
-          <w:numId w:val="5"/>
+          <w:numId w:val="10"/>
         </w:numPr>
       </w:pPr>
       <w:r>
-        <w:rPr>
-          <w:b/>
-          <w:bCs/>
-        </w:rPr>
-        <w:t>建立违规商家清退机制</w:t>
-      </w:r>
-      <w:r>
-        <w:t>：要求平台对无法提供检疫证明、伪造证明或因违规运输引发重大死亡事件的商户，实施断开链接、封禁账号等处置，并将线索依法移交农业综合行政执法部门。</w:t>
+        <w:t>依托数字监管突破“街头官僚”的执法容量瓶颈</w:t>
+      </w:r>
+    </w:p>
+    <w:p>
+      <w:pPr>
+        <w:pStyle w:val="a3"/>
+      </w:pPr>
+      <w:r>
+        <w:t>针对基层“小马拉大车”的体制困境，应当通过技术赋能，以算法规制替代部分人工核验，降低执法成本。废止易被伪造的纸质检疫证明，全面推行附带区块链存证与动态二维码的“电子检疫证明”</w:t>
+      </w:r>
+      <w:r>
+        <w:rPr>
+          <w:rFonts w:hint="eastAsia"/>
+        </w:rPr>
+        <w:t>。</w:t>
+      </w:r>
+      <w:r>
+        <w:t>结合大语言模型（LLM）与检索增强生成（RAG）技术，在监管端开发“智能动物卫生合规Agent”。该系统可自动抓取电商平台的活体交易报表与电子检疫证，实时比对产地疫病风险等级与动物种类信息，一旦发现证件造假或高风险疫区调运，自动向基层执法终端发送预警，实现从“被动响应”向“精准靶向执法”的跨越。</w:t>
       </w:r>
     </w:p>
     <w:p>
@@ -1083,7 +1111,7 @@
         <w:pStyle w:val="3"/>
       </w:pPr>
       <w:r>
-        <w:t>（二）依托数字监管突破“街头官僚”的执法容量瓶颈</w:t>
+        <w:t>（三）构建跨部门数据共享</w:t>
       </w:r>
     </w:p>
     <w:p>
@@ -1091,169 +1119,39 @@
         <w:pStyle w:val="a3"/>
       </w:pPr>
       <w:r>
-        <w:t>针对基层“小马拉大车”的体制困境，应当通过技术赋能，以算法规制替代部分人工核验，降低执法成本。</w:t>
+        <w:t>打破“属地管辖”与多头管理的壁垒，重塑网络活体流通的监管链条。农业农村部门的电子检疫数据必须向邮政管理部门开放接口。快递企业在揽收活体动物时，其终端扫码枪必须能直接校验检疫码，无码或扫码显示无效的，系统前端直接锁死，从技术上强制落实《动物防疫法》的承运人查验责任。</w:t>
+      </w:r>
+    </w:p>
+    <w:p>
+      <w:pPr>
+        <w:pStyle w:val="3"/>
+      </w:pPr>
+      <w:r>
+        <w:t>（四）细化活体动物运输的法定卫生与福利标准</w:t>
       </w:r>
     </w:p>
     <w:p>
       <w:pPr>
         <w:pStyle w:val="a3"/>
-        <w:numPr>
-          <w:ilvl w:val="0"/>
-          <w:numId w:val="6"/>
-        </w:numPr>
-      </w:pPr>
-      <w:r>
-        <w:rPr>
-          <w:b/>
-          <w:bCs/>
-        </w:rPr>
-        <w:t>全面推行检疫证明电子化与API联网</w:t>
-      </w:r>
-      <w:r>
-        <w:t>：废止易被伪造的纸质检疫证明，全面推行附带区块链存证与动态二维码的“电子检疫证明”。</w:t>
-      </w:r>
-    </w:p>
-    <w:p>
-      <w:pPr>
-        <w:pStyle w:val="a3"/>
-        <w:numPr>
-          <w:ilvl w:val="0"/>
-          <w:numId w:val="6"/>
-        </w:numPr>
-      </w:pPr>
-      <w:r>
-        <w:rPr>
-          <w:b/>
-          <w:bCs/>
-        </w:rPr>
+      </w:pPr>
+      <w:r>
+        <w:t>填补“盲盒运输”的法律真空，将动物福利诉求转化为可执行的行政卫生标准。以部门规章形式，明确不同种类宠物（如犬猫、爬行类、禽类）运输过程中的空间密度、温度控制、通风换气及最长运输时长等强制性量化标准。禁止使用不具备生命保障与卫生消毒条件的普通厢式货车混装寄递活体动物，倒逼物流行业设立专业的活体动物运输业务线。</w:t>
+      </w:r>
+    </w:p>
+    <w:p>
+      <w:pPr>
+        <w:pStyle w:val="2"/>
+      </w:pPr>
+      <w:r>
+        <w:t>六、 挑战、启示与展望</w:t>
+      </w:r>
+    </w:p>
+    <w:p>
+      <w:pPr>
+        <w:pStyle w:val="3"/>
+      </w:pPr>
+      <w:r>
         <w:lastRenderedPageBreak/>
-        <w:t>引入智能合规审查机制</w:t>
-      </w:r>
-      <w:r>
-        <w:t>：结合大语言模型（LLM）与检索增强生成（RAG）技术，在监管端开发“智能动物卫生合规Agent”。该系统可自动抓取电商平台的活体交易报表与电子检疫证，实时比对产地疫病风险等级与动物种类信息，一旦发现证件造假或高风险疫区调运，自动向基层执法终端发送预警，实现从“被动响应”向“精准靶向执法”的跨越。</w:t>
-      </w:r>
-    </w:p>
-    <w:p>
-      <w:pPr>
-        <w:pStyle w:val="3"/>
-      </w:pPr>
-      <w:r>
-        <w:t>（三）构建跨部门数据共享与信用惩戒机制</w:t>
-      </w:r>
-    </w:p>
-    <w:p>
-      <w:pPr>
-        <w:pStyle w:val="a3"/>
-      </w:pPr>
-      <w:r>
-        <w:t>打破“属地管辖”与多头管理的壁垒，重塑网络活体流通的监管链条。</w:t>
-      </w:r>
-    </w:p>
-    <w:p>
-      <w:pPr>
-        <w:pStyle w:val="a3"/>
-        <w:numPr>
-          <w:ilvl w:val="0"/>
-          <w:numId w:val="7"/>
-        </w:numPr>
-      </w:pPr>
-      <w:r>
-        <w:rPr>
-          <w:b/>
-          <w:bCs/>
-        </w:rPr>
-        <w:t>建立“农业+邮政+市场监管”联合执法接口</w:t>
-      </w:r>
-      <w:r>
-        <w:t>：强制打通部门间的数据孤岛。农业农村部门的电子检疫数据必须向邮政管理部门开放接口。快递企业在揽收活体动物时，其终端扫码枪必须能直接校验检疫码，无码或扫码显示无效的，系统前端直接锁死，从技术上强制落实《动物防疫法》的承运人查验责任。</w:t>
-      </w:r>
-    </w:p>
-    <w:p>
-      <w:pPr>
-        <w:pStyle w:val="a3"/>
-        <w:numPr>
-          <w:ilvl w:val="0"/>
-          <w:numId w:val="7"/>
-        </w:numPr>
-      </w:pPr>
-      <w:r>
-        <w:rPr>
-          <w:b/>
-          <w:bCs/>
-        </w:rPr>
-        <w:t>实施信用联合惩戒</w:t>
-      </w:r>
-      <w:r>
-        <w:t>：提高违法成本。对屡次逃避检疫、违规寄递活体动物的托运中介及繁育者，列入动物卫生监督失信黑名单，并限制其使用主流快递网络与电商平台。</w:t>
-      </w:r>
-    </w:p>
-    <w:p>
-      <w:pPr>
-        <w:pStyle w:val="3"/>
-      </w:pPr>
-      <w:r>
-        <w:t>（四）细化活体动物运输的法定卫生与福利标准</w:t>
-      </w:r>
-    </w:p>
-    <w:p>
-      <w:pPr>
-        <w:pStyle w:val="a3"/>
-      </w:pPr>
-      <w:r>
-        <w:t>填补“盲盒运输”的法律真空，将动物福利诉求转化为可执行的行政卫生标准。</w:t>
-      </w:r>
-    </w:p>
-    <w:p>
-      <w:pPr>
-        <w:pStyle w:val="a3"/>
-        <w:numPr>
-          <w:ilvl w:val="0"/>
-          <w:numId w:val="8"/>
-        </w:numPr>
-      </w:pPr>
-      <w:r>
-        <w:rPr>
-          <w:b/>
-          <w:bCs/>
-        </w:rPr>
-        <w:t>出台专门的网络活体动物寄递防疫规范</w:t>
-      </w:r>
-      <w:r>
-        <w:t>：以部门规章形式，明确不同种类宠物（如犬猫、爬行类、禽类）运输过程中的空间密度、温度控制、通风换气及最长运输时长等强制性量化标准。</w:t>
-      </w:r>
-    </w:p>
-    <w:p>
-      <w:pPr>
-        <w:pStyle w:val="a3"/>
-        <w:numPr>
-          <w:ilvl w:val="0"/>
-          <w:numId w:val="8"/>
-        </w:numPr>
-      </w:pPr>
-      <w:r>
-        <w:rPr>
-          <w:b/>
-          <w:bCs/>
-        </w:rPr>
-        <w:t>强化承运设备准入</w:t>
-      </w:r>
-      <w:r>
-        <w:t>：禁止使用不具备生命保障与卫生消毒条件的普通厢式货车混装寄递活体动物，倒逼物流行业设立专业的活体动物运输业务线。</w:t>
-      </w:r>
-    </w:p>
-    <w:p>
-      <w:pPr>
-        <w:pStyle w:val="2"/>
-      </w:pPr>
-      <w:r>
-        <w:t>六、 挑战、启示与展望</w:t>
-      </w:r>
-    </w:p>
-    <w:p>
-      <w:pPr>
-        <w:pStyle w:val="3"/>
-      </w:pPr>
-      <w:r>
         <w:t>（一）未来监管面临的挑战</w:t>
       </w:r>
     </w:p>
@@ -1281,7 +1179,7 @@
         <w:t>“算法黑箱”与行政救济</w:t>
       </w:r>
       <w:r>
-        <w:t>：当自动化系统（如合规Agent）错误拦截合规商家的交易时，如何保障行政相对人的申诉与救济渠道。</w:t>
+        <w:t>：当自动化系统错误拦截合规商家的交易时，如何保障行政相对人的申诉与救济渠道。</w:t>
       </w:r>
     </w:p>
     <w:p>
@@ -1297,7 +1195,6 @@
           <w:b/>
           <w:bCs/>
         </w:rPr>
-        <w:lastRenderedPageBreak/>
         <w:t>发展不平衡</w:t>
       </w:r>
       <w:r>
@@ -1907,6 +1804,95 @@
     </w:lvl>
   </w:abstractNum>
   <w:abstractNum w:abstractNumId="5" w15:restartNumberingAfterBreak="0">
+    <w:nsid w:val="64AA219A"/>
+    <w:multiLevelType w:val="hybridMultilevel"/>
+    <w:tmpl w:val="9C947E2A"/>
+    <w:lvl w:ilvl="0" w:tplc="F7F037AE">
+      <w:start w:val="1"/>
+      <w:numFmt w:val="japaneseCounting"/>
+      <w:lvlText w:val="（%1）"/>
+      <w:lvlJc w:val="left"/>
+      <w:pPr>
+        <w:ind w:left="852" w:hanging="852"/>
+      </w:pPr>
+      <w:rPr>
+        <w:rFonts w:hint="default"/>
+      </w:rPr>
+    </w:lvl>
+    <w:lvl w:ilvl="1" w:tplc="04090019" w:tentative="1">
+      <w:start w:val="1"/>
+      <w:numFmt w:val="lowerLetter"/>
+      <w:lvlText w:val="%2)"/>
+      <w:lvlJc w:val="left"/>
+      <w:pPr>
+        <w:ind w:left="840" w:hanging="420"/>
+      </w:pPr>
+    </w:lvl>
+    <w:lvl w:ilvl="2" w:tplc="0409001B" w:tentative="1">
+      <w:start w:val="1"/>
+      <w:numFmt w:val="lowerRoman"/>
+      <w:lvlText w:val="%3."/>
+      <w:lvlJc w:val="right"/>
+      <w:pPr>
+        <w:ind w:left="1260" w:hanging="420"/>
+      </w:pPr>
+    </w:lvl>
+    <w:lvl w:ilvl="3" w:tplc="0409000F" w:tentative="1">
+      <w:start w:val="1"/>
+      <w:numFmt w:val="decimal"/>
+      <w:lvlText w:val="%4."/>
+      <w:lvlJc w:val="left"/>
+      <w:pPr>
+        <w:ind w:left="1680" w:hanging="420"/>
+      </w:pPr>
+    </w:lvl>
+    <w:lvl w:ilvl="4" w:tplc="04090019" w:tentative="1">
+      <w:start w:val="1"/>
+      <w:numFmt w:val="lowerLetter"/>
+      <w:lvlText w:val="%5)"/>
+      <w:lvlJc w:val="left"/>
+      <w:pPr>
+        <w:ind w:left="2100" w:hanging="420"/>
+      </w:pPr>
+    </w:lvl>
+    <w:lvl w:ilvl="5" w:tplc="0409001B" w:tentative="1">
+      <w:start w:val="1"/>
+      <w:numFmt w:val="lowerRoman"/>
+      <w:lvlText w:val="%6."/>
+      <w:lvlJc w:val="right"/>
+      <w:pPr>
+        <w:ind w:left="2520" w:hanging="420"/>
+      </w:pPr>
+    </w:lvl>
+    <w:lvl w:ilvl="6" w:tplc="0409000F" w:tentative="1">
+      <w:start w:val="1"/>
+      <w:numFmt w:val="decimal"/>
+      <w:lvlText w:val="%7."/>
+      <w:lvlJc w:val="left"/>
+      <w:pPr>
+        <w:ind w:left="2940" w:hanging="420"/>
+      </w:pPr>
+    </w:lvl>
+    <w:lvl w:ilvl="7" w:tplc="04090019" w:tentative="1">
+      <w:start w:val="1"/>
+      <w:numFmt w:val="lowerLetter"/>
+      <w:lvlText w:val="%8)"/>
+      <w:lvlJc w:val="left"/>
+      <w:pPr>
+        <w:ind w:left="3360" w:hanging="420"/>
+      </w:pPr>
+    </w:lvl>
+    <w:lvl w:ilvl="8" w:tplc="0409001B" w:tentative="1">
+      <w:start w:val="1"/>
+      <w:numFmt w:val="lowerRoman"/>
+      <w:lvlText w:val="%9."/>
+      <w:lvlJc w:val="right"/>
+      <w:pPr>
+        <w:ind w:left="3780" w:hanging="420"/>
+      </w:pPr>
+    </w:lvl>
+  </w:abstractNum>
+  <w:abstractNum w:abstractNumId="6" w15:restartNumberingAfterBreak="0">
     <w:nsid w:val="66AE61F6"/>
     <w:multiLevelType w:val="multilevel"/>
     <w:tmpl w:val="F1B2D91C"/>
@@ -2019,7 +2005,7 @@
       </w:pPr>
     </w:lvl>
   </w:abstractNum>
-  <w:abstractNum w:abstractNumId="6" w15:restartNumberingAfterBreak="0">
+  <w:abstractNum w:abstractNumId="7" w15:restartNumberingAfterBreak="0">
     <w:nsid w:val="6AC25EBA"/>
     <w:multiLevelType w:val="multilevel"/>
     <w:tmpl w:val="93C2ED58"/>
@@ -2132,7 +2118,7 @@
       </w:pPr>
     </w:lvl>
   </w:abstractNum>
-  <w:abstractNum w:abstractNumId="7" w15:restartNumberingAfterBreak="0">
+  <w:abstractNum w:abstractNumId="8" w15:restartNumberingAfterBreak="0">
     <w:nsid w:val="719A6C0D"/>
     <w:multiLevelType w:val="multilevel"/>
     <w:tmpl w:val="D5FE0170"/>
@@ -2245,7 +2231,7 @@
       </w:pPr>
     </w:lvl>
   </w:abstractNum>
-  <w:abstractNum w:abstractNumId="8" w15:restartNumberingAfterBreak="0">
+  <w:abstractNum w:abstractNumId="9" w15:restartNumberingAfterBreak="0">
     <w:nsid w:val="77FE2BAF"/>
     <w:multiLevelType w:val="multilevel"/>
     <w:tmpl w:val="019633C8"/>
@@ -2359,7 +2345,7 @@
     </w:lvl>
   </w:abstractNum>
   <w:num w:numId="1">
-    <w:abstractNumId w:val="6"/>
+    <w:abstractNumId w:val="7"/>
   </w:num>
   <w:num w:numId="2">
     <w:abstractNumId w:val="1"/>
@@ -2371,18 +2357,21 @@
     <w:abstractNumId w:val="2"/>
   </w:num>
   <w:num w:numId="5">
-    <w:abstractNumId w:val="7"/>
+    <w:abstractNumId w:val="8"/>
   </w:num>
   <w:num w:numId="6">
     <w:abstractNumId w:val="3"/>
   </w:num>
   <w:num w:numId="7">
-    <w:abstractNumId w:val="8"/>
+    <w:abstractNumId w:val="9"/>
   </w:num>
   <w:num w:numId="8">
     <w:abstractNumId w:val="0"/>
   </w:num>
   <w:num w:numId="9">
+    <w:abstractNumId w:val="6"/>
+  </w:num>
+  <w:num w:numId="10">
     <w:abstractNumId w:val="5"/>
   </w:num>
 </w:numbering>

</xml_diff>